<commit_message>
feat: added tally implementation & fixed qoutation
</commit_message>
<xml_diff>
--- a/services/template_document.docx
+++ b/services/template_document.docx
@@ -70,7 +70,6 @@
         <w:rPr>
           <w:color w:val="000080"/>
           <w:sz w:val="20"/>
-          <w:szCs w:val="20"/>
         </w:rPr>
         <w:t xml:space="preserve">126, </w:t>
       </w:r>
@@ -78,7 +77,6 @@
         <w:rPr>
           <w:color w:val="17127E"/>
           <w:sz w:val="20"/>
-          <w:szCs w:val="20"/>
         </w:rPr>
         <w:t>Top Syringe Compound, W. E. Highway, B/H. Samrat Hotel, Pandurang</w:t>
       </w:r>
@@ -87,7 +85,6 @@
           <w:color w:val="17127E"/>
           <w:spacing w:val="-8"/>
           <w:sz w:val="20"/>
-          <w:szCs w:val="20"/>
         </w:rPr>
         <w:t xml:space="preserve"> </w:t>
       </w:r>
@@ -95,7 +92,6 @@
         <w:rPr>
           <w:color w:val="17127E"/>
           <w:sz w:val="20"/>
-          <w:szCs w:val="20"/>
         </w:rPr>
         <w:t>Wadi,</w:t>
       </w:r>
@@ -104,16 +100,13 @@
           <w:color w:val="17127E"/>
           <w:spacing w:val="-4"/>
           <w:sz w:val="20"/>
-          <w:szCs w:val="20"/>
-        </w:rPr>
-        <w:t xml:space="preserve"> </w:t>
-      </w:r>
-      <w:proofErr w:type="gramStart"/>
+        </w:rPr>
+        <w:t xml:space="preserve"> </w:t>
+      </w:r>
       <w:r>
         <w:rPr>
           <w:color w:val="17127E"/>
           <w:sz w:val="20"/>
-          <w:szCs w:val="20"/>
         </w:rPr>
         <w:t>PO</w:t>
       </w:r>
@@ -122,7 +115,6 @@
           <w:color w:val="17127E"/>
           <w:spacing w:val="-4"/>
           <w:sz w:val="20"/>
-          <w:szCs w:val="20"/>
         </w:rPr>
         <w:t xml:space="preserve"> </w:t>
       </w:r>
@@ -130,17 +122,14 @@
         <w:rPr>
           <w:color w:val="17127E"/>
           <w:sz w:val="20"/>
-          <w:szCs w:val="20"/>
         </w:rPr>
         <w:t>:</w:t>
       </w:r>
-      <w:proofErr w:type="gramEnd"/>
       <w:r>
         <w:rPr>
           <w:color w:val="17127E"/>
           <w:spacing w:val="-5"/>
           <w:sz w:val="20"/>
-          <w:szCs w:val="20"/>
         </w:rPr>
         <w:t xml:space="preserve"> </w:t>
       </w:r>
@@ -148,7 +137,6 @@
         <w:rPr>
           <w:color w:val="17127E"/>
           <w:sz w:val="20"/>
-          <w:szCs w:val="20"/>
         </w:rPr>
         <w:t>Mira</w:t>
       </w:r>
@@ -157,7 +145,6 @@
           <w:color w:val="17127E"/>
           <w:spacing w:val="-4"/>
           <w:sz w:val="20"/>
-          <w:szCs w:val="20"/>
         </w:rPr>
         <w:t xml:space="preserve"> </w:t>
       </w:r>
@@ -165,7 +152,6 @@
         <w:rPr>
           <w:color w:val="17127E"/>
           <w:sz w:val="20"/>
-          <w:szCs w:val="20"/>
         </w:rPr>
         <w:t>(Mira</w:t>
       </w:r>
@@ -174,7 +160,6 @@
           <w:color w:val="17127E"/>
           <w:spacing w:val="-4"/>
           <w:sz w:val="20"/>
-          <w:szCs w:val="20"/>
         </w:rPr>
         <w:t xml:space="preserve"> </w:t>
       </w:r>
@@ -182,7 +167,6 @@
         <w:rPr>
           <w:color w:val="17127E"/>
           <w:sz w:val="20"/>
-          <w:szCs w:val="20"/>
         </w:rPr>
         <w:t>Road –</w:t>
       </w:r>
@@ -191,7 +175,6 @@
           <w:color w:val="17127E"/>
           <w:spacing w:val="-5"/>
           <w:sz w:val="20"/>
-          <w:szCs w:val="20"/>
         </w:rPr>
         <w:t xml:space="preserve"> </w:t>
       </w:r>
@@ -199,7 +182,6 @@
         <w:rPr>
           <w:color w:val="17127E"/>
           <w:sz w:val="20"/>
-          <w:szCs w:val="20"/>
         </w:rPr>
         <w:t>East),</w:t>
       </w:r>
@@ -208,16 +190,13 @@
           <w:color w:val="17127E"/>
           <w:spacing w:val="-3"/>
           <w:sz w:val="20"/>
-          <w:szCs w:val="20"/>
-        </w:rPr>
-        <w:t xml:space="preserve"> </w:t>
-      </w:r>
-      <w:proofErr w:type="gramStart"/>
+        </w:rPr>
+        <w:t xml:space="preserve"> </w:t>
+      </w:r>
       <w:r>
         <w:rPr>
           <w:color w:val="17127E"/>
           <w:sz w:val="20"/>
-          <w:szCs w:val="20"/>
         </w:rPr>
         <w:t>Dist.</w:t>
       </w:r>
@@ -226,7 +205,6 @@
           <w:color w:val="17127E"/>
           <w:spacing w:val="-4"/>
           <w:sz w:val="20"/>
-          <w:szCs w:val="20"/>
         </w:rPr>
         <w:t xml:space="preserve"> </w:t>
       </w:r>
@@ -234,17 +212,14 @@
         <w:rPr>
           <w:color w:val="17127E"/>
           <w:sz w:val="20"/>
-          <w:szCs w:val="20"/>
         </w:rPr>
         <w:t>:</w:t>
       </w:r>
-      <w:proofErr w:type="gramEnd"/>
       <w:r>
         <w:rPr>
           <w:color w:val="17127E"/>
           <w:spacing w:val="-7"/>
           <w:sz w:val="20"/>
-          <w:szCs w:val="20"/>
         </w:rPr>
         <w:t xml:space="preserve"> </w:t>
       </w:r>
@@ -252,7 +227,6 @@
         <w:rPr>
           <w:color w:val="17127E"/>
           <w:sz w:val="20"/>
-          <w:szCs w:val="20"/>
         </w:rPr>
         <w:t>Thane</w:t>
       </w:r>
@@ -261,7 +235,6 @@
           <w:color w:val="17127E"/>
           <w:spacing w:val="-2"/>
           <w:sz w:val="20"/>
-          <w:szCs w:val="20"/>
         </w:rPr>
         <w:t xml:space="preserve"> </w:t>
       </w:r>
@@ -269,7 +242,6 @@
         <w:rPr>
           <w:color w:val="17127E"/>
           <w:sz w:val="20"/>
-          <w:szCs w:val="20"/>
         </w:rPr>
         <w:t>–</w:t>
       </w:r>
@@ -278,7 +250,6 @@
           <w:color w:val="17127E"/>
           <w:spacing w:val="-3"/>
           <w:sz w:val="20"/>
-          <w:szCs w:val="20"/>
         </w:rPr>
         <w:t xml:space="preserve"> </w:t>
       </w:r>
@@ -286,7 +257,6 @@
         <w:rPr>
           <w:color w:val="17127E"/>
           <w:sz w:val="20"/>
-          <w:szCs w:val="20"/>
         </w:rPr>
         <w:t>401</w:t>
       </w:r>
@@ -295,7 +265,6 @@
           <w:color w:val="17127E"/>
           <w:spacing w:val="-3"/>
           <w:sz w:val="20"/>
-          <w:szCs w:val="20"/>
         </w:rPr>
         <w:t xml:space="preserve"> </w:t>
       </w:r>
@@ -303,7 +272,6 @@
         <w:rPr>
           <w:color w:val="17127E"/>
           <w:sz w:val="20"/>
-          <w:szCs w:val="20"/>
         </w:rPr>
         <w:t xml:space="preserve">104. </w:t>
       </w:r>
@@ -312,7 +280,6 @@
           <w:color w:val="17127E"/>
           <w:spacing w:val="-4"/>
           <w:sz w:val="20"/>
-          <w:szCs w:val="20"/>
         </w:rPr>
         <w:t>Mob</w:t>
       </w:r>
@@ -322,13 +289,6 @@
           <w:sz w:val="20"/>
         </w:rPr>
         <w:tab/>
-      </w:r>
-      <w:r>
-        <w:rPr>
-          <w:color w:val="17127E"/>
-          <w:sz w:val="20"/>
-          <w:szCs w:val="20"/>
-        </w:rPr>
         <w:t>:</w:t>
       </w:r>
       <w:r>
@@ -336,7 +296,6 @@
           <w:color w:val="17127E"/>
           <w:spacing w:val="40"/>
           <w:sz w:val="20"/>
-          <w:szCs w:val="20"/>
         </w:rPr>
         <w:t xml:space="preserve"> </w:t>
       </w:r>
@@ -344,7 +303,6 @@
         <w:rPr>
           <w:color w:val="17127E"/>
           <w:sz w:val="20"/>
-          <w:szCs w:val="20"/>
         </w:rPr>
         <w:t>+91</w:t>
       </w:r>
@@ -353,7 +311,6 @@
           <w:color w:val="17127E"/>
           <w:spacing w:val="40"/>
           <w:sz w:val="20"/>
-          <w:szCs w:val="20"/>
         </w:rPr>
         <w:t xml:space="preserve"> </w:t>
       </w:r>
@@ -361,7 +318,6 @@
         <w:rPr>
           <w:color w:val="17127E"/>
           <w:sz w:val="20"/>
-          <w:szCs w:val="20"/>
         </w:rPr>
         <w:t>8657537516 /</w:t>
       </w:r>
@@ -370,7 +326,6 @@
           <w:color w:val="17127E"/>
           <w:spacing w:val="40"/>
           <w:sz w:val="20"/>
-          <w:szCs w:val="20"/>
         </w:rPr>
         <w:t xml:space="preserve"> </w:t>
       </w:r>
@@ -378,7 +333,6 @@
         <w:rPr>
           <w:color w:val="17127E"/>
           <w:sz w:val="20"/>
-          <w:szCs w:val="20"/>
         </w:rPr>
         <w:t>9619741622</w:t>
       </w:r>
@@ -388,7 +342,6 @@
         <w:pStyle w:val="Heading2"/>
         <w:spacing w:before="5"/>
       </w:pPr>
-      <w:proofErr w:type="gramStart"/>
       <w:r>
         <w:rPr>
           <w:color w:val="20409A"/>
@@ -408,7 +361,6 @@
         </w:rPr>
         <w:t>:</w:t>
       </w:r>
-      <w:proofErr w:type="gramEnd"/>
       <w:r>
         <w:rPr>
           <w:color w:val="20409A"/>
@@ -416,10 +368,9 @@
         </w:rPr>
         <w:t xml:space="preserve"> </w:t>
       </w:r>
-      <w:hyperlink r:id="rId7" w:history="1">
+      <w:hyperlink r:id="rId7">
         <w:r>
           <w:rPr>
-            <w:rStyle w:val="Hyperlink"/>
             <w:color w:val="20409A"/>
           </w:rPr>
           <w:t>sales@tempo.net.in,</w:t>
@@ -432,7 +383,6 @@
         </w:rPr>
         <w:t xml:space="preserve"> </w:t>
       </w:r>
-      <w:proofErr w:type="gramStart"/>
       <w:r>
         <w:rPr>
           <w:color w:val="20409A"/>
@@ -452,7 +402,6 @@
         </w:rPr>
         <w:t>:</w:t>
       </w:r>
-      <w:proofErr w:type="gramEnd"/>
       <w:r>
         <w:rPr>
           <w:color w:val="20409A"/>
@@ -460,10 +409,9 @@
         </w:rPr>
         <w:t xml:space="preserve"> </w:t>
       </w:r>
-      <w:hyperlink r:id="rId8" w:history="1">
+      <w:hyperlink r:id="rId8">
         <w:r>
           <w:rPr>
-            <w:rStyle w:val="Hyperlink"/>
             <w:color w:val="20409A"/>
             <w:spacing w:val="-2"/>
           </w:rPr>
@@ -502,7 +450,7 @@
         </w:rPr>
         <w:drawing>
           <wp:inline distT="0" distB="0" distL="0" distR="0" wp14:anchorId="394A6483" wp14:editId="75FED7D1">
-            <wp:extent cx="685800" cy="733425"/>
+            <wp:extent cx="682388" cy="731139"/>
             <wp:effectExtent l="0" t="0" r="0" b="0"/>
             <wp:docPr id="3" name="Image 3"/>
             <wp:cNvGraphicFramePr>
@@ -551,7 +499,7 @@
         </w:rPr>
         <w:drawing>
           <wp:inline distT="0" distB="0" distL="0" distR="0" wp14:anchorId="4CAA7226" wp14:editId="41E9F425">
-            <wp:extent cx="1543050" cy="561975"/>
+            <wp:extent cx="1544687" cy="563499"/>
             <wp:effectExtent l="0" t="0" r="0" b="0"/>
             <wp:docPr id="4" name="Image 4"/>
             <wp:cNvGraphicFramePr>
@@ -599,7 +547,6 @@
         <w:rPr>
           <w:b/>
           <w:sz w:val="15"/>
-          <w:szCs w:val="15"/>
         </w:rPr>
         <w:t>ISO</w:t>
       </w:r>
@@ -608,7 +555,6 @@
           <w:b/>
           <w:spacing w:val="-6"/>
           <w:sz w:val="15"/>
-          <w:szCs w:val="15"/>
         </w:rPr>
         <w:t xml:space="preserve"> </w:t>
       </w:r>
@@ -617,7 +563,6 @@
           <w:b/>
           <w:spacing w:val="-2"/>
           <w:sz w:val="15"/>
-          <w:szCs w:val="15"/>
         </w:rPr>
         <w:t>9001:2015</w:t>
       </w:r>
@@ -736,18 +681,8 @@
           <w:sz w:val="24"/>
           <w:szCs w:val="24"/>
         </w:rPr>
-        <w:t xml:space="preserve">Ref. </w:t>
-      </w:r>
-      <w:proofErr w:type="gramStart"/>
-      <w:r>
-        <w:rPr>
-          <w:b/>
-          <w:sz w:val="24"/>
-          <w:szCs w:val="24"/>
-        </w:rPr>
-        <w:t>No. :</w:t>
-      </w:r>
-      <w:proofErr w:type="gramEnd"/>
+        <w:t>Ref. No. :</w:t>
+      </w:r>
       <w:r>
         <w:rPr>
           <w:b/>
@@ -772,9 +707,16 @@
           <w:sz w:val="28"/>
           <w:szCs w:val="28"/>
         </w:rPr>
-        <w:t>{</w:t>
-      </w:r>
-      <w:proofErr w:type="spellStart"/>
+        <w:t>{quote_num}</w:t>
+      </w:r>
+      <w:r>
+        <w:rPr>
+          <w:b/>
+          <w:color w:val="000000"/>
+          <w:sz w:val="28"/>
+        </w:rPr>
+        <w:tab/>
+      </w:r>
       <w:r>
         <w:rPr>
           <w:b/>
@@ -782,36 +724,8 @@
           <w:sz w:val="28"/>
           <w:szCs w:val="28"/>
         </w:rPr>
-        <w:t>quote_num</w:t>
-      </w:r>
-      <w:proofErr w:type="spellEnd"/>
-      <w:r>
-        <w:rPr>
-          <w:b/>
-          <w:color w:val="000000"/>
-          <w:sz w:val="28"/>
-          <w:szCs w:val="28"/>
-        </w:rPr>
-        <w:t>}</w:t>
-      </w:r>
-      <w:r>
-        <w:rPr>
-          <w:b/>
-          <w:color w:val="000000"/>
-          <w:sz w:val="28"/>
-        </w:rPr>
-        <w:tab/>
-      </w:r>
-      <w:r>
-        <w:rPr>
-          <w:b/>
-          <w:color w:val="000000"/>
-          <w:sz w:val="28"/>
-          <w:szCs w:val="28"/>
-        </w:rPr>
         <w:t xml:space="preserve">                                                               </w:t>
       </w:r>
-      <w:proofErr w:type="gramStart"/>
       <w:r>
         <w:rPr>
           <w:b/>
@@ -828,28 +742,7 @@
           <w:sz w:val="18"/>
           <w:szCs w:val="18"/>
         </w:rPr>
-        <w:t>{</w:t>
-      </w:r>
-      <w:proofErr w:type="spellStart"/>
-      <w:proofErr w:type="gramEnd"/>
-      <w:r>
-        <w:rPr>
-          <w:b/>
-          <w:color w:val="000000"/>
-          <w:sz w:val="18"/>
-          <w:szCs w:val="18"/>
-        </w:rPr>
-        <w:t>current_date</w:t>
-      </w:r>
-      <w:proofErr w:type="spellEnd"/>
-      <w:r>
-        <w:rPr>
-          <w:b/>
-          <w:color w:val="000000"/>
-          <w:sz w:val="18"/>
-          <w:szCs w:val="18"/>
-        </w:rPr>
-        <w:t>}</w:t>
+        <w:t>{current_date}</w:t>
       </w:r>
       <w:r>
         <w:rPr>
@@ -876,27 +769,7 @@
           <w:sz w:val="24"/>
           <w:szCs w:val="24"/>
         </w:rPr>
-        <w:t>{</w:t>
-      </w:r>
-      <w:proofErr w:type="spellStart"/>
-      <w:r>
-        <w:rPr>
-          <w:b/>
-          <w:color w:val="000000"/>
-          <w:sz w:val="24"/>
-          <w:szCs w:val="24"/>
-        </w:rPr>
-        <w:t>client_company</w:t>
-      </w:r>
-      <w:proofErr w:type="spellEnd"/>
-      <w:r>
-        <w:rPr>
-          <w:b/>
-          <w:color w:val="000000"/>
-          <w:sz w:val="24"/>
-          <w:szCs w:val="24"/>
-        </w:rPr>
-        <w:t>}</w:t>
+        <w:t>{client_company}</w:t>
       </w:r>
     </w:p>
     <w:p>
@@ -914,22 +787,13 @@
         <w:ind w:left="141" w:right="7020"/>
       </w:pPr>
       <w:r>
-        <w:t>{</w:t>
-      </w:r>
-      <w:proofErr w:type="spellStart"/>
-      <w:r>
-        <w:t>client_city-client_postal_code</w:t>
-      </w:r>
-      <w:proofErr w:type="spellEnd"/>
-      <w:r>
-        <w:t>}</w:t>
+        <w:t>{client_city-client_postal_code}</w:t>
       </w:r>
     </w:p>
     <w:p>
       <w:pPr>
         <w:ind w:left="196"/>
       </w:pPr>
-      <w:proofErr w:type="gramStart"/>
       <w:r>
         <w:rPr>
           <w:rFonts w:ascii="Wingdings" w:eastAsia="Wingdings" w:hAnsi="Wingdings" w:cs="Wingdings"/>
@@ -945,50 +809,12 @@
       <w:r>
         <w:t>:</w:t>
       </w:r>
-      <w:proofErr w:type="gramEnd"/>
       <w:r>
         <w:rPr>
           <w:spacing w:val="-2"/>
         </w:rPr>
-        <w:t xml:space="preserve"> </w:t>
-      </w:r>
-      <w:hyperlink r:id="rId12" w:history="1">
-        <w:r>
-          <w:rPr>
-            <w:rStyle w:val="Hyperlink"/>
-            <w:rFonts w:ascii="Arial MT" w:hAnsi="Arial MT"/>
-            <w:color w:val="467886"/>
-            <w:spacing w:val="-2"/>
-            <w:sz w:val="20"/>
-            <w:szCs w:val="20"/>
-          </w:rPr>
-          <w:t>{</w:t>
-        </w:r>
-        <w:proofErr w:type="spellStart"/>
-        <w:r>
-          <w:rPr>
-            <w:rStyle w:val="Hyperlink"/>
-            <w:rFonts w:ascii="Arial MT" w:hAnsi="Arial MT"/>
-            <w:color w:val="467886"/>
-            <w:spacing w:val="-2"/>
-            <w:sz w:val="20"/>
-            <w:szCs w:val="20"/>
-          </w:rPr>
-          <w:t>client_email</w:t>
-        </w:r>
-        <w:proofErr w:type="spellEnd"/>
-        <w:r>
-          <w:rPr>
-            <w:rStyle w:val="Hyperlink"/>
-            <w:rFonts w:ascii="Arial MT" w:hAnsi="Arial MT"/>
-            <w:color w:val="467886"/>
-            <w:spacing w:val="-2"/>
-            <w:sz w:val="20"/>
-            <w:szCs w:val="20"/>
-          </w:rPr>
-          <w:t>}</w:t>
-        </w:r>
-      </w:hyperlink>
+        <w:t xml:space="preserve"> {client_email}</w:t>
+      </w:r>
     </w:p>
     <w:p>
       <w:pPr>
@@ -1014,21 +840,7 @@
         <w:t xml:space="preserve"> </w:t>
       </w:r>
       <w:r>
-        <w:t xml:space="preserve">Attn.: </w:t>
-      </w:r>
-      <w:r>
-        <w:t>{</w:t>
-      </w:r>
-      <w:proofErr w:type="spellStart"/>
-      <w:r>
-        <w:t>buyer_name</w:t>
-      </w:r>
-      <w:proofErr w:type="spellEnd"/>
-      <w:r>
-        <w:t>}</w:t>
-      </w:r>
-      <w:r>
-        <w:t xml:space="preserve"> (</w:t>
+        <w:t>Attn.: {buyer_name} (</w:t>
       </w:r>
       <w:r>
         <w:rPr>
@@ -1046,7 +858,6 @@
       <w:r>
         <w:t>{</w:t>
       </w:r>
-      <w:proofErr w:type="spellStart"/>
       <w:r>
         <w:rPr>
           <w:rFonts w:ascii="Arial MT" w:eastAsia="Arial MT" w:hAnsi="Arial MT" w:cs="Arial MT"/>
@@ -1054,26 +865,7 @@
           <w:sz w:val="24"/>
           <w:szCs w:val="24"/>
         </w:rPr>
-        <w:t>buyer_phone_num</w:t>
-      </w:r>
-      <w:r>
-        <w:rPr>
-          <w:rFonts w:ascii="Arial MT" w:eastAsia="Arial MT" w:hAnsi="Arial MT" w:cs="Arial MT"/>
-          <w:b w:val="0"/>
-          <w:sz w:val="24"/>
-          <w:szCs w:val="24"/>
-        </w:rPr>
-        <w:t>ber</w:t>
-      </w:r>
-      <w:proofErr w:type="spellEnd"/>
-      <w:r>
-        <w:rPr>
-          <w:rFonts w:ascii="Arial MT" w:eastAsia="Arial MT" w:hAnsi="Arial MT" w:cs="Arial MT"/>
-          <w:b w:val="0"/>
-          <w:sz w:val="24"/>
-          <w:szCs w:val="24"/>
-        </w:rPr>
-        <w:t>}</w:t>
+        <w:t>buyer_phone_number}</w:t>
       </w:r>
       <w:r>
         <w:t xml:space="preserve">) </w:t>
@@ -1112,11 +904,9 @@
         </w:rPr>
         <w:t xml:space="preserve"> </w:t>
       </w:r>
-      <w:proofErr w:type="spellStart"/>
       <w:r>
         <w:t>Whatsapp</w:t>
       </w:r>
-      <w:proofErr w:type="spellEnd"/>
       <w:r>
         <w:rPr>
           <w:spacing w:val="19"/>
@@ -1142,15 +932,7 @@
         <w:t xml:space="preserve"> </w:t>
       </w:r>
       <w:r>
-        <w:t>{</w:t>
-      </w:r>
-      <w:proofErr w:type="spellStart"/>
-      <w:r>
-        <w:t>date_input</w:t>
-      </w:r>
-      <w:proofErr w:type="spellEnd"/>
-      <w:r>
-        <w:t>}</w:t>
+        <w:t>{date_input}</w:t>
       </w:r>
     </w:p>
     <w:p>
@@ -1202,7 +984,7 @@
         <mc:AlternateContent>
           <mc:Choice Requires="wps">
             <w:drawing>
-              <wp:anchor distT="0" distB="0" distL="0" distR="0" simplePos="0" relativeHeight="487587840" behindDoc="1" locked="0" layoutInCell="1" allowOverlap="1" wp14:anchorId="47480F33" wp14:editId="327BF69D">
+              <wp:anchor distT="0" distB="0" distL="0" distR="0" simplePos="0" relativeHeight="251659264" behindDoc="1" locked="0" layoutInCell="1" allowOverlap="1" wp14:anchorId="3B3883C6" wp14:editId="02241F2C">
                 <wp:simplePos x="0" y="0"/>
                 <wp:positionH relativeFrom="page">
                   <wp:posOffset>701344</wp:posOffset>
@@ -1291,7 +1073,7 @@
           </mc:Choice>
           <mc:Fallback>
             <w:pict>
-              <v:shape w14:anchorId="109F0063" id="Graphic 5" o:spid="_x0000_s1026" style="position:absolute;margin-left:55.2pt;margin-top:15.4pt;width:507.6pt;height:2.2pt;z-index:-15728640;visibility:visible;mso-wrap-style:square;mso-wrap-distance-left:0;mso-wrap-distance-top:0;mso-wrap-distance-right:0;mso-wrap-distance-bottom:0;mso-position-horizontal:absolute;mso-position-horizontal-relative:page;mso-position-vertical:absolute;mso-position-vertical-relative:text;v-text-anchor:top" coordsize="6446520,27940" o:gfxdata="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" path="m6446266,18288l,18288r,9144l6446266,27432r,-9144xem6446266,l,,,9144r6446266,l6446266,xe" fillcolor="black" stroked="f">
+              <v:shape w14:anchorId="08255382" id="Graphic 5" o:spid="_x0000_s1026" style="position:absolute;margin-left:55.2pt;margin-top:15.4pt;width:507.6pt;height:2.2pt;z-index:-251657216;visibility:visible;mso-wrap-style:square;mso-wrap-distance-left:0;mso-wrap-distance-top:0;mso-wrap-distance-right:0;mso-wrap-distance-bottom:0;mso-position-horizontal:absolute;mso-position-horizontal-relative:page;mso-position-vertical:absolute;mso-position-vertical-relative:text;v-text-anchor:top" coordsize="6446520,27940" o:gfxdata="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" path="m6446266,18288l,18288r,9144l6446266,27432r,-9144xem6446266,l,,,9144r6446266,l6446266,xe" fillcolor="black" stroked="f">
                 <v:path arrowok="t"/>
                 <w10:wrap type="topAndBottom" anchorx="page"/>
               </v:shape>
@@ -1631,7 +1413,6 @@
         </w:rPr>
         <w:t>{</w:t>
       </w:r>
-      <w:proofErr w:type="spellStart"/>
       <w:r>
         <w:rPr>
           <w:bCs/>
@@ -1639,84 +1420,8 @@
           <w:sz w:val="28"/>
           <w:szCs w:val="28"/>
         </w:rPr>
-        <w:t>product_group</w:t>
-      </w:r>
-      <w:proofErr w:type="spellEnd"/>
-      <w:r>
-        <w:rPr>
-          <w:bCs/>
-          <w:spacing w:val="-2"/>
-          <w:sz w:val="28"/>
-          <w:szCs w:val="28"/>
-        </w:rPr>
-        <w:t>}</w:t>
-      </w:r>
-    </w:p>
-    <w:p>
-      <w:pPr>
-        <w:tabs>
-          <w:tab w:val="left" w:pos="5052"/>
-        </w:tabs>
-        <w:spacing w:before="137"/>
-        <w:ind w:left="141"/>
-        <w:rPr>
-          <w:bCs/>
-          <w:i/>
-          <w:sz w:val="24"/>
-        </w:rPr>
-      </w:pPr>
-    </w:p>
-    <w:p>
-      <w:pPr>
-        <w:pStyle w:val="BodyText"/>
-        <w:spacing w:before="5"/>
-        <w:rPr>
-          <w:b/>
-          <w:i/>
-          <w:sz w:val="28"/>
-          <w:szCs w:val="28"/>
-        </w:rPr>
-      </w:pPr>
-      <w:r>
-        <w:rPr>
-          <w:sz w:val="28"/>
-          <w:szCs w:val="28"/>
-        </w:rPr>
-        <w:t xml:space="preserve">    Product Details: {</w:t>
-      </w:r>
-      <w:proofErr w:type="spellStart"/>
-      <w:r>
-        <w:rPr>
-          <w:sz w:val="28"/>
-          <w:szCs w:val="28"/>
-        </w:rPr>
-        <w:t>product_details</w:t>
-      </w:r>
-      <w:proofErr w:type="spellEnd"/>
-      <w:r>
-        <w:rPr>
-          <w:sz w:val="28"/>
-          <w:szCs w:val="28"/>
-        </w:rPr>
-        <w:t>}</w:t>
-      </w:r>
-    </w:p>
-    <w:p>
-      <w:pPr>
-        <w:pStyle w:val="TableParagraph"/>
-        <w:spacing w:line="217" w:lineRule="exact"/>
-        <w:rPr>
-          <w:sz w:val="28"/>
-          <w:szCs w:val="28"/>
-        </w:rPr>
-        <w:sectPr>
-          <w:type w:val="continuous"/>
-          <w:pgSz w:w="11910" w:h="16840" w:code="9"/>
-          <w:pgMar w:top="440" w:right="425" w:bottom="1460" w:left="992" w:header="0" w:footer="1270" w:gutter="0"/>
-          <w:cols w:space="720"/>
-          <w:docGrid w:linePitch="299"/>
-        </w:sectPr>
-      </w:pPr>
+        <w:t>product_group}</w:t>
+      </w:r>
     </w:p>
     <w:p>
       <w:pPr>
@@ -1735,24 +1440,19 @@
           <w:sz w:val="28"/>
           <w:szCs w:val="28"/>
         </w:rPr>
-        <w:t>{</w:t>
-      </w:r>
-      <w:proofErr w:type="spellStart"/>
-      <w:r>
-        <w:rPr>
-          <w:sz w:val="28"/>
-          <w:szCs w:val="28"/>
-        </w:rPr>
-        <w:t>special_model_table</w:t>
-      </w:r>
-      <w:proofErr w:type="spellEnd"/>
-      <w:r>
-        <w:rPr>
-          <w:sz w:val="28"/>
-          <w:szCs w:val="28"/>
-        </w:rPr>
-        <w:t>}</w:t>
-      </w:r>
+        <w:t>{special_model_table}</w:t>
+      </w:r>
+    </w:p>
+    <w:p>
+      <w:pPr>
+        <w:pStyle w:val="BodyText"/>
+        <w:spacing w:before="15"/>
+        <w:rPr>
+          <w:b/>
+          <w:i/>
+          <w:sz w:val="20"/>
+        </w:rPr>
+      </w:pPr>
     </w:p>
     <w:p>
       <w:pPr>
@@ -2416,21 +2116,12 @@
               </w:rPr>
               <w:t xml:space="preserve"> </w:t>
             </w:r>
-            <w:proofErr w:type="spellStart"/>
-            <w:r>
-              <w:rPr>
-                <w:sz w:val="20"/>
-                <w:szCs w:val="20"/>
-              </w:rPr>
-              <w:t>upto</w:t>
-            </w:r>
-            <w:proofErr w:type="spellEnd"/>
-            <w:r>
-              <w:rPr>
-                <w:sz w:val="20"/>
-                <w:szCs w:val="20"/>
-              </w:rPr>
-              <w:t xml:space="preserve"> customer destination will be borne by customer.</w:t>
+            <w:r>
+              <w:rPr>
+                <w:sz w:val="20"/>
+                <w:szCs w:val="20"/>
+              </w:rPr>
+              <w:t>upto customer destination will be borne by customer.</w:t>
             </w:r>
           </w:p>
         </w:tc>
@@ -4542,25 +4233,7 @@
                 <w:sz w:val="19"/>
                 <w:szCs w:val="19"/>
               </w:rPr>
-              <w:t xml:space="preserve">. All equipment will be delivered </w:t>
-            </w:r>
-            <w:proofErr w:type="spellStart"/>
-            <w:r>
-              <w:rPr>
-                <w:color w:val="000000"/>
-                <w:sz w:val="19"/>
-                <w:szCs w:val="19"/>
-              </w:rPr>
-              <w:t>upto</w:t>
-            </w:r>
-            <w:proofErr w:type="spellEnd"/>
-            <w:r>
-              <w:rPr>
-                <w:color w:val="000000"/>
-                <w:sz w:val="19"/>
-                <w:szCs w:val="19"/>
-              </w:rPr>
-              <w:t xml:space="preserve"> main gate of the customer premises. Unloading of material &amp; moving inside the lab. or working place must be taken care by customer i.e. </w:t>
+              <w:t xml:space="preserve">. All equipment will be delivered upto main gate of the customer premises. Unloading of material &amp; moving inside the lab. or working place must be taken care by customer i.e. </w:t>
             </w:r>
             <w:r>
               <w:rPr>
@@ -5152,7 +4825,6 @@
           <w:b/>
           <w:spacing w:val="-7"/>
           <w:sz w:val="26"/>
-          <w:szCs w:val="26"/>
           <w:u w:val="single"/>
         </w:rPr>
         <w:t xml:space="preserve">WARRANTY </w:t>
@@ -5162,7 +4834,6 @@
           <w:b/>
           <w:spacing w:val="-4"/>
           <w:sz w:val="26"/>
-          <w:szCs w:val="26"/>
           <w:u w:val="single"/>
         </w:rPr>
         <w:t>TERMS</w:t>
@@ -5201,11 +4872,9 @@
         </w:rPr>
         <w:t xml:space="preserve"> </w:t>
       </w:r>
-      <w:proofErr w:type="spellStart"/>
       <w:r>
         <w:t>equipments</w:t>
       </w:r>
-      <w:proofErr w:type="spellEnd"/>
       <w:r>
         <w:rPr>
           <w:spacing w:val="-8"/>
@@ -5237,7 +4906,6 @@
         <w:rPr>
           <w:b/>
           <w:sz w:val="18"/>
-          <w:szCs w:val="18"/>
         </w:rPr>
         <w:t>TWELVE</w:t>
       </w:r>
@@ -5246,7 +4914,6 @@
           <w:b/>
           <w:spacing w:val="-3"/>
           <w:sz w:val="18"/>
-          <w:szCs w:val="18"/>
         </w:rPr>
         <w:t xml:space="preserve"> </w:t>
       </w:r>
@@ -5254,7 +4921,6 @@
         <w:rPr>
           <w:b/>
           <w:sz w:val="18"/>
-          <w:szCs w:val="18"/>
         </w:rPr>
         <w:t>MONTHS</w:t>
       </w:r>
@@ -5263,7 +4929,6 @@
           <w:b/>
           <w:spacing w:val="-6"/>
           <w:sz w:val="18"/>
-          <w:szCs w:val="18"/>
         </w:rPr>
         <w:t xml:space="preserve"> </w:t>
       </w:r>
@@ -5339,11 +5004,9 @@
         </w:rPr>
         <w:t xml:space="preserve"> </w:t>
       </w:r>
-      <w:proofErr w:type="gramStart"/>
       <w:r>
         <w:t>However</w:t>
       </w:r>
-      <w:proofErr w:type="gramEnd"/>
       <w:r>
         <w:rPr>
           <w:spacing w:val="-4"/>
@@ -5369,15 +5032,7 @@
         <w:t xml:space="preserve"> </w:t>
       </w:r>
       <w:r>
-        <w:t xml:space="preserve">information the </w:t>
-      </w:r>
-      <w:proofErr w:type="spellStart"/>
-      <w:r>
-        <w:t>equipments</w:t>
-      </w:r>
-      <w:proofErr w:type="spellEnd"/>
-      <w:r>
-        <w:t xml:space="preserve"> warranty as below:</w:t>
+        <w:t>information the equipments warranty as below:</w:t>
       </w:r>
     </w:p>
     <w:p>
@@ -5399,7 +5054,6 @@
       <w:r>
         <w:rPr>
           <w:sz w:val="16"/>
-          <w:szCs w:val="16"/>
         </w:rPr>
         <w:t>Hot</w:t>
       </w:r>
@@ -5407,14 +5061,12 @@
         <w:rPr>
           <w:spacing w:val="-9"/>
           <w:sz w:val="16"/>
-          <w:szCs w:val="16"/>
         </w:rPr>
         <w:t xml:space="preserve"> </w:t>
       </w:r>
       <w:r>
         <w:rPr>
           <w:sz w:val="16"/>
-          <w:szCs w:val="16"/>
         </w:rPr>
         <w:t>Plates,</w:t>
       </w:r>
@@ -5422,14 +5074,12 @@
         <w:rPr>
           <w:spacing w:val="-9"/>
           <w:sz w:val="16"/>
-          <w:szCs w:val="16"/>
         </w:rPr>
         <w:t xml:space="preserve"> </w:t>
       </w:r>
       <w:r>
         <w:rPr>
           <w:sz w:val="16"/>
-          <w:szCs w:val="16"/>
         </w:rPr>
         <w:t>Temperature</w:t>
       </w:r>
@@ -5437,14 +5087,12 @@
         <w:rPr>
           <w:spacing w:val="-8"/>
           <w:sz w:val="16"/>
-          <w:szCs w:val="16"/>
         </w:rPr>
         <w:t xml:space="preserve"> </w:t>
       </w:r>
       <w:r>
         <w:rPr>
           <w:sz w:val="16"/>
-          <w:szCs w:val="16"/>
         </w:rPr>
         <w:t>control</w:t>
       </w:r>
@@ -5452,14 +5100,12 @@
         <w:rPr>
           <w:spacing w:val="-8"/>
           <w:sz w:val="16"/>
-          <w:szCs w:val="16"/>
         </w:rPr>
         <w:t xml:space="preserve"> </w:t>
       </w:r>
       <w:r>
         <w:rPr>
           <w:sz w:val="16"/>
-          <w:szCs w:val="16"/>
         </w:rPr>
         <w:t>units</w:t>
       </w:r>
@@ -5467,14 +5113,12 @@
         <w:rPr>
           <w:spacing w:val="-10"/>
           <w:sz w:val="16"/>
-          <w:szCs w:val="16"/>
         </w:rPr>
         <w:t xml:space="preserve"> </w:t>
       </w:r>
       <w:r>
         <w:rPr>
           <w:sz w:val="16"/>
-          <w:szCs w:val="16"/>
         </w:rPr>
         <w:t>Heating</w:t>
       </w:r>
@@ -5482,14 +5126,12 @@
         <w:rPr>
           <w:spacing w:val="-9"/>
           <w:sz w:val="16"/>
-          <w:szCs w:val="16"/>
         </w:rPr>
         <w:t xml:space="preserve"> </w:t>
       </w:r>
       <w:r>
         <w:rPr>
           <w:sz w:val="16"/>
-          <w:szCs w:val="16"/>
         </w:rPr>
         <w:t>Mantles,</w:t>
       </w:r>
@@ -5497,14 +5139,12 @@
         <w:rPr>
           <w:spacing w:val="-6"/>
           <w:sz w:val="16"/>
-          <w:szCs w:val="16"/>
         </w:rPr>
         <w:t xml:space="preserve"> </w:t>
       </w:r>
       <w:r>
         <w:rPr>
           <w:sz w:val="16"/>
-          <w:szCs w:val="16"/>
         </w:rPr>
         <w:t>Ovens,</w:t>
       </w:r>
@@ -5512,14 +5152,12 @@
         <w:rPr>
           <w:spacing w:val="-5"/>
           <w:sz w:val="16"/>
-          <w:szCs w:val="16"/>
         </w:rPr>
         <w:t xml:space="preserve"> </w:t>
       </w:r>
       <w:r>
         <w:rPr>
           <w:sz w:val="16"/>
-          <w:szCs w:val="16"/>
         </w:rPr>
         <w:t>Incubators,</w:t>
       </w:r>
@@ -5527,14 +5165,12 @@
         <w:rPr>
           <w:spacing w:val="-8"/>
           <w:sz w:val="16"/>
-          <w:szCs w:val="16"/>
         </w:rPr>
         <w:t xml:space="preserve"> </w:t>
       </w:r>
       <w:r>
         <w:rPr>
           <w:sz w:val="16"/>
-          <w:szCs w:val="16"/>
         </w:rPr>
         <w:t>Soxhlet</w:t>
       </w:r>
@@ -5542,14 +5178,12 @@
         <w:rPr>
           <w:spacing w:val="-6"/>
           <w:sz w:val="16"/>
-          <w:szCs w:val="16"/>
         </w:rPr>
         <w:t xml:space="preserve"> </w:t>
       </w:r>
       <w:r>
         <w:rPr>
           <w:sz w:val="16"/>
-          <w:szCs w:val="16"/>
         </w:rPr>
         <w:t>Extraction</w:t>
       </w:r>
@@ -5557,14 +5191,12 @@
         <w:rPr>
           <w:spacing w:val="-6"/>
           <w:sz w:val="16"/>
-          <w:szCs w:val="16"/>
         </w:rPr>
         <w:t xml:space="preserve"> </w:t>
       </w:r>
       <w:r>
         <w:rPr>
           <w:sz w:val="16"/>
-          <w:szCs w:val="16"/>
         </w:rPr>
         <w:t>Heaters</w:t>
       </w:r>
@@ -5572,14 +5204,12 @@
         <w:rPr>
           <w:spacing w:val="-7"/>
           <w:sz w:val="16"/>
-          <w:szCs w:val="16"/>
         </w:rPr>
         <w:t xml:space="preserve"> </w:t>
       </w:r>
       <w:r>
         <w:rPr>
           <w:sz w:val="16"/>
-          <w:szCs w:val="16"/>
         </w:rPr>
         <w:t>are</w:t>
       </w:r>
@@ -5587,14 +5217,12 @@
         <w:rPr>
           <w:spacing w:val="-8"/>
           <w:sz w:val="16"/>
-          <w:szCs w:val="16"/>
         </w:rPr>
         <w:t xml:space="preserve"> </w:t>
       </w:r>
       <w:r>
         <w:rPr>
           <w:sz w:val="16"/>
-          <w:szCs w:val="16"/>
         </w:rPr>
         <w:t>fully</w:t>
       </w:r>
@@ -5602,7 +5230,6 @@
         <w:rPr>
           <w:spacing w:val="-9"/>
           <w:sz w:val="16"/>
-          <w:szCs w:val="16"/>
         </w:rPr>
         <w:t xml:space="preserve"> </w:t>
       </w:r>
@@ -5610,7 +5237,6 @@
         <w:rPr>
           <w:spacing w:val="-2"/>
           <w:sz w:val="16"/>
-          <w:szCs w:val="16"/>
         </w:rPr>
         <w:t>guaranteed.</w:t>
       </w:r>
@@ -5633,38 +5259,19 @@
       <w:r>
         <w:rPr>
           <w:sz w:val="16"/>
-          <w:szCs w:val="16"/>
-        </w:rPr>
-        <w:t xml:space="preserve">Water stills / Water Baths / constant temperature Bath &amp; </w:t>
-      </w:r>
-      <w:proofErr w:type="spellStart"/>
-      <w:r>
-        <w:rPr>
-          <w:sz w:val="16"/>
-          <w:szCs w:val="16"/>
-        </w:rPr>
-        <w:t>Cryo</w:t>
-      </w:r>
-      <w:proofErr w:type="spellEnd"/>
-      <w:r>
-        <w:rPr>
-          <w:sz w:val="16"/>
-          <w:szCs w:val="16"/>
-        </w:rPr>
-        <w:t xml:space="preserve"> Bath are also guaranteed for 12 months excluding heating elements, as</w:t>
+        </w:rPr>
+        <w:t>Water stills / Water Baths / constant temperature Bath &amp; Cryo Bath are also guaranteed for 12 months excluding heating elements, as</w:t>
       </w:r>
       <w:r>
         <w:rPr>
           <w:spacing w:val="40"/>
           <w:sz w:val="16"/>
-          <w:szCs w:val="16"/>
         </w:rPr>
         <w:t xml:space="preserve"> </w:t>
       </w:r>
       <w:r>
         <w:rPr>
           <w:sz w:val="16"/>
-          <w:szCs w:val="16"/>
         </w:rPr>
         <w:t>these parts (Heating Element) are not manufactured by us.</w:t>
       </w:r>
@@ -5672,25 +5279,14 @@
         <w:rPr>
           <w:spacing w:val="40"/>
           <w:sz w:val="16"/>
-          <w:szCs w:val="16"/>
-        </w:rPr>
-        <w:t xml:space="preserve"> </w:t>
-      </w:r>
-      <w:proofErr w:type="gramStart"/>
+        </w:rPr>
+        <w:t xml:space="preserve"> </w:t>
+      </w:r>
       <w:r>
         <w:rPr>
           <w:sz w:val="16"/>
-          <w:szCs w:val="16"/>
-        </w:rPr>
-        <w:t>However</w:t>
-      </w:r>
-      <w:proofErr w:type="gramEnd"/>
-      <w:r>
-        <w:rPr>
-          <w:sz w:val="16"/>
-          <w:szCs w:val="16"/>
-        </w:rPr>
-        <w:t xml:space="preserve"> our customers are assured of rigorous tests of these parts.</w:t>
+        </w:rPr>
+        <w:t>However our customers are assured of rigorous tests of these parts.</w:t>
       </w:r>
     </w:p>
     <w:p>
@@ -5709,11 +5305,9 @@
           <w:sz w:val="16"/>
         </w:rPr>
       </w:pPr>
-      <w:proofErr w:type="gramStart"/>
       <w:r>
         <w:rPr>
           <w:sz w:val="16"/>
-          <w:szCs w:val="16"/>
         </w:rPr>
         <w:t>Furnaces</w:t>
       </w:r>
@@ -5721,30 +5315,25 @@
         <w:rPr>
           <w:spacing w:val="-5"/>
           <w:sz w:val="16"/>
-          <w:szCs w:val="16"/>
         </w:rPr>
         <w:t xml:space="preserve"> </w:t>
       </w:r>
       <w:r>
         <w:rPr>
           <w:sz w:val="16"/>
-          <w:szCs w:val="16"/>
         </w:rPr>
         <w:t>:</w:t>
       </w:r>
-      <w:proofErr w:type="gramEnd"/>
       <w:r>
         <w:rPr>
           <w:spacing w:val="-3"/>
           <w:sz w:val="16"/>
-          <w:szCs w:val="16"/>
         </w:rPr>
         <w:t xml:space="preserve"> </w:t>
       </w:r>
       <w:r>
         <w:rPr>
           <w:sz w:val="16"/>
-          <w:szCs w:val="16"/>
         </w:rPr>
         <w:t>In</w:t>
       </w:r>
@@ -5752,14 +5341,12 @@
         <w:rPr>
           <w:spacing w:val="-3"/>
           <w:sz w:val="16"/>
-          <w:szCs w:val="16"/>
         </w:rPr>
         <w:t xml:space="preserve"> </w:t>
       </w:r>
       <w:r>
         <w:rPr>
           <w:sz w:val="16"/>
-          <w:szCs w:val="16"/>
         </w:rPr>
         <w:t>case</w:t>
       </w:r>
@@ -5767,14 +5354,12 @@
         <w:rPr>
           <w:spacing w:val="-7"/>
           <w:sz w:val="16"/>
-          <w:szCs w:val="16"/>
         </w:rPr>
         <w:t xml:space="preserve"> </w:t>
       </w:r>
       <w:r>
         <w:rPr>
           <w:sz w:val="16"/>
-          <w:szCs w:val="16"/>
         </w:rPr>
         <w:t>of</w:t>
       </w:r>
@@ -5782,14 +5367,12 @@
         <w:rPr>
           <w:spacing w:val="-5"/>
           <w:sz w:val="16"/>
-          <w:szCs w:val="16"/>
         </w:rPr>
         <w:t xml:space="preserve"> </w:t>
       </w:r>
       <w:r>
         <w:rPr>
           <w:sz w:val="16"/>
-          <w:szCs w:val="16"/>
         </w:rPr>
         <w:t>furnaces,</w:t>
       </w:r>
@@ -5797,14 +5380,12 @@
         <w:rPr>
           <w:spacing w:val="-6"/>
           <w:sz w:val="16"/>
-          <w:szCs w:val="16"/>
         </w:rPr>
         <w:t xml:space="preserve"> </w:t>
       </w:r>
       <w:r>
         <w:rPr>
           <w:sz w:val="16"/>
-          <w:szCs w:val="16"/>
         </w:rPr>
         <w:t>the</w:t>
       </w:r>
@@ -5812,14 +5393,12 @@
         <w:rPr>
           <w:spacing w:val="-7"/>
           <w:sz w:val="16"/>
-          <w:szCs w:val="16"/>
         </w:rPr>
         <w:t xml:space="preserve"> </w:t>
       </w:r>
       <w:r>
         <w:rPr>
           <w:sz w:val="16"/>
-          <w:szCs w:val="16"/>
         </w:rPr>
         <w:t>heating</w:t>
       </w:r>
@@ -5827,14 +5406,12 @@
         <w:rPr>
           <w:spacing w:val="-5"/>
           <w:sz w:val="16"/>
-          <w:szCs w:val="16"/>
         </w:rPr>
         <w:t xml:space="preserve"> </w:t>
       </w:r>
       <w:r>
         <w:rPr>
           <w:sz w:val="16"/>
-          <w:szCs w:val="16"/>
         </w:rPr>
         <w:t>element</w:t>
       </w:r>
@@ -5842,14 +5419,12 @@
         <w:rPr>
           <w:spacing w:val="-5"/>
           <w:sz w:val="16"/>
-          <w:szCs w:val="16"/>
         </w:rPr>
         <w:t xml:space="preserve"> </w:t>
       </w:r>
       <w:r>
         <w:rPr>
           <w:sz w:val="16"/>
-          <w:szCs w:val="16"/>
         </w:rPr>
         <w:t>does</w:t>
       </w:r>
@@ -5857,14 +5432,12 @@
         <w:rPr>
           <w:spacing w:val="-5"/>
           <w:sz w:val="16"/>
-          <w:szCs w:val="16"/>
         </w:rPr>
         <w:t xml:space="preserve"> </w:t>
       </w:r>
       <w:r>
         <w:rPr>
           <w:sz w:val="16"/>
-          <w:szCs w:val="16"/>
         </w:rPr>
         <w:t>not</w:t>
       </w:r>
@@ -5872,14 +5445,12 @@
         <w:rPr>
           <w:spacing w:val="-5"/>
           <w:sz w:val="16"/>
-          <w:szCs w:val="16"/>
         </w:rPr>
         <w:t xml:space="preserve"> </w:t>
       </w:r>
       <w:r>
         <w:rPr>
           <w:sz w:val="16"/>
-          <w:szCs w:val="16"/>
         </w:rPr>
         <w:t>carry</w:t>
       </w:r>
@@ -5887,14 +5458,12 @@
         <w:rPr>
           <w:spacing w:val="-7"/>
           <w:sz w:val="16"/>
-          <w:szCs w:val="16"/>
         </w:rPr>
         <w:t xml:space="preserve"> </w:t>
       </w:r>
       <w:r>
         <w:rPr>
           <w:sz w:val="16"/>
-          <w:szCs w:val="16"/>
         </w:rPr>
         <w:t>any</w:t>
       </w:r>
@@ -5902,15 +5471,12 @@
         <w:rPr>
           <w:spacing w:val="-10"/>
           <w:sz w:val="16"/>
-          <w:szCs w:val="16"/>
-        </w:rPr>
-        <w:t xml:space="preserve"> </w:t>
-      </w:r>
-      <w:proofErr w:type="gramStart"/>
+        </w:rPr>
+        <w:t xml:space="preserve"> </w:t>
+      </w:r>
       <w:r>
         <w:rPr>
           <w:sz w:val="16"/>
-          <w:szCs w:val="16"/>
         </w:rPr>
         <w:t>Warranty</w:t>
       </w:r>
@@ -5918,7 +5484,6 @@
         <w:rPr>
           <w:spacing w:val="-7"/>
           <w:sz w:val="16"/>
-          <w:szCs w:val="16"/>
         </w:rPr>
         <w:t xml:space="preserve"> </w:t>
       </w:r>
@@ -5926,18 +5491,8 @@
         <w:rPr>
           <w:spacing w:val="-5"/>
           <w:sz w:val="16"/>
-          <w:szCs w:val="16"/>
-        </w:rPr>
-        <w:t>:</w:t>
-      </w:r>
-      <w:proofErr w:type="gramEnd"/>
-      <w:r>
-        <w:rPr>
-          <w:spacing w:val="-5"/>
-          <w:sz w:val="16"/>
-          <w:szCs w:val="16"/>
-        </w:rPr>
-        <w:t>-</w:t>
+        </w:rPr>
+        <w:t>:-</w:t>
       </w:r>
     </w:p>
     <w:p>
@@ -6054,11 +5609,9 @@
         </w:rPr>
         <w:t xml:space="preserve"> </w:t>
       </w:r>
-      <w:proofErr w:type="gramStart"/>
       <w:r>
         <w:t>users</w:t>
       </w:r>
-      <w:proofErr w:type="gramEnd"/>
       <w:r>
         <w:rPr>
           <w:spacing w:val="-1"/>
@@ -6167,15 +5720,7 @@
         <w:t xml:space="preserve"> </w:t>
       </w:r>
       <w:r>
-        <w:t xml:space="preserve">Inner </w:t>
-      </w:r>
-      <w:proofErr w:type="spellStart"/>
-      <w:r>
-        <w:t>mould</w:t>
-      </w:r>
-      <w:proofErr w:type="spellEnd"/>
-      <w:r>
-        <w:t xml:space="preserve"> of</w:t>
+        <w:t>Inner mould of</w:t>
       </w:r>
       <w:r>
         <w:rPr>
@@ -6300,13 +5845,8 @@
         </w:rPr>
         <w:t xml:space="preserve"> </w:t>
       </w:r>
-      <w:proofErr w:type="gramStart"/>
-      <w:r>
-        <w:t>filled</w:t>
-      </w:r>
-      <w:proofErr w:type="gramEnd"/>
-      <w:r>
-        <w:t xml:space="preserve"> we</w:t>
+      <w:r>
+        <w:t>filled we</w:t>
       </w:r>
       <w:r>
         <w:rPr>
@@ -6378,15 +5918,7 @@
         <w:t xml:space="preserve"> </w:t>
       </w:r>
       <w:r>
-        <w:t xml:space="preserve">cracks. If customer requires our service </w:t>
-      </w:r>
-      <w:proofErr w:type="gramStart"/>
-      <w:r>
-        <w:t>engineer</w:t>
-      </w:r>
-      <w:proofErr w:type="gramEnd"/>
-      <w:r>
-        <w:t xml:space="preserve"> then visit charges will be EXTRA</w:t>
+        <w:t>cracks. If customer requires our service engineer then visit charges will be EXTRA</w:t>
       </w:r>
     </w:p>
     <w:p>
@@ -6400,7 +5932,6 @@
       <w:r>
         <w:rPr>
           <w:sz w:val="20"/>
-          <w:szCs w:val="20"/>
         </w:rPr>
         <w:t>Please</w:t>
       </w:r>
@@ -6408,14 +5939,12 @@
         <w:rPr>
           <w:spacing w:val="-5"/>
           <w:sz w:val="20"/>
-          <w:szCs w:val="20"/>
         </w:rPr>
         <w:t xml:space="preserve"> </w:t>
       </w:r>
       <w:r>
         <w:rPr>
           <w:sz w:val="20"/>
-          <w:szCs w:val="20"/>
         </w:rPr>
         <w:t>find</w:t>
       </w:r>
@@ -6423,14 +5952,12 @@
         <w:rPr>
           <w:spacing w:val="-4"/>
           <w:sz w:val="20"/>
-          <w:szCs w:val="20"/>
         </w:rPr>
         <w:t xml:space="preserve"> </w:t>
       </w:r>
       <w:r>
         <w:rPr>
           <w:sz w:val="20"/>
-          <w:szCs w:val="20"/>
         </w:rPr>
         <w:t>the</w:t>
       </w:r>
@@ -6438,14 +5965,12 @@
         <w:rPr>
           <w:spacing w:val="-5"/>
           <w:sz w:val="20"/>
-          <w:szCs w:val="20"/>
         </w:rPr>
         <w:t xml:space="preserve"> </w:t>
       </w:r>
       <w:r>
         <w:rPr>
           <w:sz w:val="20"/>
-          <w:szCs w:val="20"/>
         </w:rPr>
         <w:t>above</w:t>
       </w:r>
@@ -6453,14 +5978,12 @@
         <w:rPr>
           <w:spacing w:val="-5"/>
           <w:sz w:val="20"/>
-          <w:szCs w:val="20"/>
         </w:rPr>
         <w:t xml:space="preserve"> </w:t>
       </w:r>
       <w:r>
         <w:rPr>
           <w:sz w:val="20"/>
-          <w:szCs w:val="20"/>
         </w:rPr>
         <w:t>in</w:t>
       </w:r>
@@ -6468,14 +5991,12 @@
         <w:rPr>
           <w:spacing w:val="-7"/>
           <w:sz w:val="20"/>
-          <w:szCs w:val="20"/>
         </w:rPr>
         <w:t xml:space="preserve"> </w:t>
       </w:r>
       <w:r>
         <w:rPr>
           <w:sz w:val="20"/>
-          <w:szCs w:val="20"/>
         </w:rPr>
         <w:t>order</w:t>
       </w:r>
@@ -6483,14 +6004,12 @@
         <w:rPr>
           <w:spacing w:val="-4"/>
           <w:sz w:val="20"/>
-          <w:szCs w:val="20"/>
         </w:rPr>
         <w:t xml:space="preserve"> </w:t>
       </w:r>
       <w:r>
         <w:rPr>
           <w:sz w:val="20"/>
-          <w:szCs w:val="20"/>
         </w:rPr>
         <w:t>and</w:t>
       </w:r>
@@ -6498,14 +6017,12 @@
         <w:rPr>
           <w:spacing w:val="-4"/>
           <w:sz w:val="20"/>
-          <w:szCs w:val="20"/>
         </w:rPr>
         <w:t xml:space="preserve"> </w:t>
       </w:r>
       <w:r>
         <w:rPr>
           <w:sz w:val="20"/>
-          <w:szCs w:val="20"/>
         </w:rPr>
         <w:t>acknowledge</w:t>
       </w:r>
@@ -6513,14 +6030,12 @@
         <w:rPr>
           <w:spacing w:val="-5"/>
           <w:sz w:val="20"/>
-          <w:szCs w:val="20"/>
         </w:rPr>
         <w:t xml:space="preserve"> </w:t>
       </w:r>
       <w:r>
         <w:rPr>
           <w:sz w:val="20"/>
-          <w:szCs w:val="20"/>
         </w:rPr>
         <w:t>the</w:t>
       </w:r>
@@ -6528,7 +6043,6 @@
         <w:rPr>
           <w:spacing w:val="-5"/>
           <w:sz w:val="20"/>
-          <w:szCs w:val="20"/>
         </w:rPr>
         <w:t xml:space="preserve"> </w:t>
       </w:r>
@@ -6536,7 +6050,6 @@
         <w:rPr>
           <w:spacing w:val="-2"/>
           <w:sz w:val="20"/>
-          <w:szCs w:val="20"/>
         </w:rPr>
         <w:t>receipt.</w:t>
       </w:r>
@@ -6567,7 +6080,6 @@
         <w:rPr>
           <w:b/>
           <w:sz w:val="24"/>
-          <w:szCs w:val="24"/>
         </w:rPr>
         <w:t>For</w:t>
       </w:r>
@@ -6576,7 +6088,6 @@
           <w:b/>
           <w:spacing w:val="37"/>
           <w:sz w:val="24"/>
-          <w:szCs w:val="24"/>
         </w:rPr>
         <w:t xml:space="preserve"> </w:t>
       </w:r>
@@ -6584,7 +6095,6 @@
         <w:rPr>
           <w:b/>
           <w:sz w:val="24"/>
-          <w:szCs w:val="24"/>
         </w:rPr>
         <w:t>TEMPO</w:t>
       </w:r>
@@ -6593,7 +6103,6 @@
           <w:b/>
           <w:spacing w:val="-6"/>
           <w:sz w:val="24"/>
-          <w:szCs w:val="24"/>
         </w:rPr>
         <w:t xml:space="preserve"> </w:t>
       </w:r>
@@ -6601,7 +6110,6 @@
         <w:rPr>
           <w:b/>
           <w:sz w:val="24"/>
-          <w:szCs w:val="24"/>
         </w:rPr>
         <w:t>INSTRUMENTS</w:t>
       </w:r>
@@ -6610,7 +6118,6 @@
           <w:b/>
           <w:spacing w:val="-6"/>
           <w:sz w:val="24"/>
-          <w:szCs w:val="24"/>
         </w:rPr>
         <w:t xml:space="preserve"> </w:t>
       </w:r>
@@ -6618,7 +6125,6 @@
         <w:rPr>
           <w:b/>
           <w:sz w:val="24"/>
-          <w:szCs w:val="24"/>
         </w:rPr>
         <w:t>PVT.</w:t>
       </w:r>
@@ -6627,7 +6133,6 @@
           <w:b/>
           <w:spacing w:val="-6"/>
           <w:sz w:val="24"/>
-          <w:szCs w:val="24"/>
         </w:rPr>
         <w:t xml:space="preserve"> </w:t>
       </w:r>
@@ -6636,7 +6141,6 @@
           <w:b/>
           <w:spacing w:val="-4"/>
           <w:sz w:val="24"/>
-          <w:szCs w:val="24"/>
         </w:rPr>
         <w:t>LTD.</w:t>
       </w:r>
@@ -6655,9 +6159,18 @@
           <w:szCs w:val="24"/>
           <w:highlight w:val="cyan"/>
         </w:rPr>
-        <w:t>{</w:t>
-      </w:r>
-      <w:proofErr w:type="spellStart"/>
+        <w:t>{sales_user_name}(</w:t>
+      </w:r>
+      <w:r>
+        <w:rPr>
+          <w:rFonts w:ascii="Webdings" w:eastAsia="Webdings" w:hAnsi="Webdings" w:cs="Webdings"/>
+          <w:color w:val="000000"/>
+          <w:sz w:val="24"/>
+          <w:szCs w:val="24"/>
+          <w:highlight w:val="cyan"/>
+        </w:rPr>
+        <w:t></w:t>
+      </w:r>
       <w:r>
         <w:rPr>
           <w:b/>
@@ -6666,70 +6179,7 @@
           <w:szCs w:val="24"/>
           <w:highlight w:val="cyan"/>
         </w:rPr>
-        <w:t>sales_user_</w:t>
-      </w:r>
-      <w:proofErr w:type="gramStart"/>
-      <w:r>
-        <w:rPr>
-          <w:b/>
-          <w:color w:val="000000"/>
-          <w:sz w:val="24"/>
-          <w:szCs w:val="24"/>
-          <w:highlight w:val="cyan"/>
-        </w:rPr>
-        <w:t>name</w:t>
-      </w:r>
-      <w:proofErr w:type="spellEnd"/>
-      <w:r>
-        <w:rPr>
-          <w:b/>
-          <w:color w:val="000000"/>
-          <w:sz w:val="24"/>
-          <w:szCs w:val="24"/>
-          <w:highlight w:val="cyan"/>
-        </w:rPr>
-        <w:t>}</w:t>
-      </w:r>
-      <w:r>
-        <w:rPr>
-          <w:b/>
-          <w:color w:val="000000"/>
-          <w:sz w:val="24"/>
-          <w:szCs w:val="24"/>
-          <w:highlight w:val="cyan"/>
-        </w:rPr>
-        <w:t>(</w:t>
-      </w:r>
-      <w:proofErr w:type="gramEnd"/>
-      <w:r>
-        <w:rPr>
-          <w:rFonts w:ascii="Webdings" w:eastAsia="Webdings" w:hAnsi="Webdings" w:cs="Webdings"/>
-          <w:color w:val="000000"/>
-          <w:sz w:val="24"/>
-          <w:szCs w:val="24"/>
-          <w:highlight w:val="cyan"/>
-        </w:rPr>
-        <w:t></w:t>
-      </w:r>
-      <w:r>
-        <w:rPr>
-          <w:b/>
-          <w:color w:val="000000"/>
-          <w:sz w:val="24"/>
-          <w:szCs w:val="24"/>
-          <w:highlight w:val="cyan"/>
-        </w:rPr>
-        <w:t>:</w:t>
-      </w:r>
-      <w:r>
-        <w:rPr>
-          <w:b/>
-          <w:color w:val="000000"/>
-          <w:sz w:val="24"/>
-          <w:szCs w:val="24"/>
-          <w:highlight w:val="cyan"/>
-        </w:rPr>
-        <w:t xml:space="preserve"> </w:t>
+        <w:t xml:space="preserve">: </w:t>
       </w:r>
       <w:r>
         <w:rPr>
@@ -6741,7 +6191,6 @@
         </w:rPr>
         <w:t>{</w:t>
       </w:r>
-      <w:proofErr w:type="spellStart"/>
       <w:r>
         <w:rPr>
           <w:b/>
@@ -6752,7 +6201,6 @@
         </w:rPr>
         <w:t>business_phone</w:t>
       </w:r>
-      <w:proofErr w:type="spellEnd"/>
       <w:r>
         <w:rPr>
           <w:rFonts w:ascii="Arial" w:eastAsia="Arial" w:hAnsi="Arial" w:cs="Arial"/>
@@ -6799,7 +6247,6 @@
                 <w:sz w:val="20"/>
               </w:rPr>
             </w:pPr>
-            <w:proofErr w:type="gramStart"/>
             <w:r>
               <w:rPr>
                 <w:b/>
@@ -6826,7 +6273,6 @@
               </w:rPr>
               <w:t>:</w:t>
             </w:r>
-            <w:proofErr w:type="gramEnd"/>
           </w:p>
           <w:p>
             <w:pPr>
@@ -6957,15 +6403,7 @@
                 <w:sz w:val="21"/>
                 <w:szCs w:val="21"/>
               </w:rPr>
-              <w:t>Mob.</w:t>
-            </w:r>
-            <w:r>
-              <w:rPr>
-                <w:spacing w:val="-4"/>
-                <w:sz w:val="21"/>
-                <w:szCs w:val="21"/>
-              </w:rPr>
-              <w:t xml:space="preserve"> </w:t>
+              <w:t xml:space="preserve">Mob. </w:t>
             </w:r>
             <w:r>
               <w:rPr>
@@ -6975,29 +6413,7 @@
                 <w:sz w:val="20"/>
                 <w:szCs w:val="20"/>
               </w:rPr>
-              <w:t>{</w:t>
-            </w:r>
-            <w:proofErr w:type="spellStart"/>
-            <w:r>
-              <w:rPr>
-                <w:b/>
-                <w:color w:val="000000"/>
-                <w:spacing w:val="-2"/>
-                <w:sz w:val="20"/>
-                <w:szCs w:val="20"/>
-              </w:rPr>
-              <w:t>business_phone</w:t>
-            </w:r>
-            <w:proofErr w:type="spellEnd"/>
-            <w:r>
-              <w:rPr>
-                <w:b/>
-                <w:color w:val="000000"/>
-                <w:spacing w:val="-2"/>
-                <w:sz w:val="20"/>
-                <w:szCs w:val="20"/>
-              </w:rPr>
-              <w:t xml:space="preserve">} </w:t>
+              <w:t xml:space="preserve">{business_phone} </w:t>
             </w:r>
             <w:r>
               <w:rPr>
@@ -7022,16 +6438,7 @@
                 <w:sz w:val="21"/>
                 <w:szCs w:val="21"/>
               </w:rPr>
-              <w:t>your</w:t>
-            </w:r>
-            <w:r>
-              <w:rPr>
-                <w:color w:val="000000"/>
-                <w:spacing w:val="-4"/>
-                <w:sz w:val="21"/>
-                <w:szCs w:val="21"/>
-              </w:rPr>
-              <w:t xml:space="preserve"> </w:t>
+              <w:t xml:space="preserve">your </w:t>
             </w:r>
             <w:r>
               <w:rPr>
@@ -7040,7 +6447,16 @@
                 <w:sz w:val="21"/>
                 <w:szCs w:val="21"/>
               </w:rPr>
-              <w:t>email</w:t>
+              <w:t xml:space="preserve">email </w:t>
+            </w:r>
+            <w:r>
+              <w:rPr>
+                <w:color w:val="000000"/>
+                <w:spacing w:val="-10"/>
+                <w:sz w:val="21"/>
+                <w:szCs w:val="21"/>
+              </w:rPr>
+              <w:t xml:space="preserve">/ </w:t>
             </w:r>
             <w:r>
               <w:rPr>
@@ -7049,43 +6465,7 @@
                 <w:sz w:val="21"/>
                 <w:szCs w:val="21"/>
               </w:rPr>
-              <w:t xml:space="preserve"> </w:t>
-            </w:r>
-            <w:r>
-              <w:rPr>
-                <w:color w:val="000000"/>
-                <w:spacing w:val="-10"/>
-                <w:sz w:val="21"/>
-                <w:szCs w:val="21"/>
-              </w:rPr>
-              <w:t>/</w:t>
-            </w:r>
-            <w:r>
-              <w:rPr>
-                <w:color w:val="000000"/>
-                <w:spacing w:val="-10"/>
-                <w:sz w:val="21"/>
-                <w:szCs w:val="21"/>
-              </w:rPr>
-              <w:t xml:space="preserve"> </w:t>
-            </w:r>
-            <w:r>
-              <w:rPr>
-                <w:color w:val="000000"/>
-                <w:spacing w:val="-2"/>
-                <w:sz w:val="21"/>
-                <w:szCs w:val="21"/>
-              </w:rPr>
-              <w:t>queries</w:t>
-            </w:r>
-            <w:r>
-              <w:rPr>
-                <w:color w:val="000000"/>
-                <w:spacing w:val="-2"/>
-                <w:sz w:val="21"/>
-                <w:szCs w:val="21"/>
-              </w:rPr>
-              <w:t xml:space="preserve"> </w:t>
+              <w:t xml:space="preserve">queries </w:t>
             </w:r>
             <w:r>
               <w:rPr>
@@ -7096,7 +6476,6 @@
               </w:rPr>
               <w:t xml:space="preserve">to </w:t>
             </w:r>
-            <w:proofErr w:type="gramStart"/>
             <w:r>
               <w:rPr>
                 <w:rFonts w:ascii="Wingdings" w:eastAsia="Wingdings" w:hAnsi="Wingdings" w:cs="Wingdings"/>
@@ -7112,126 +6491,26 @@
             <w:r>
               <w:t>:</w:t>
             </w:r>
-            <w:proofErr w:type="gramEnd"/>
             <w:r>
               <w:rPr>
                 <w:spacing w:val="56"/>
               </w:rPr>
               <w:t xml:space="preserve"> </w:t>
             </w:r>
-            <w:hyperlink r:id="rId13" w:history="1">
-              <w:r>
-                <w:rPr>
-                  <w:rStyle w:val="Hyperlink"/>
-                  <w:b/>
-                  <w:color w:val="467886"/>
-                  <w:spacing w:val="-2"/>
-                </w:rPr>
-                <w:t>{</w:t>
-              </w:r>
-              <w:proofErr w:type="spellStart"/>
-              <w:r>
-                <w:rPr>
-                  <w:rStyle w:val="Hyperlink"/>
-                  <w:b/>
-                  <w:color w:val="467886"/>
-                  <w:spacing w:val="-2"/>
-                </w:rPr>
-                <w:t>sales_user_email</w:t>
-              </w:r>
-              <w:proofErr w:type="spellEnd"/>
-              <w:r>
-                <w:rPr>
-                  <w:rStyle w:val="Hyperlink"/>
-                  <w:b/>
-                  <w:color w:val="467886"/>
-                  <w:spacing w:val="-2"/>
-                </w:rPr>
-                <w:t>}</w:t>
-              </w:r>
-            </w:hyperlink>
-            <w:r>
-              <w:t xml:space="preserve"> </w:t>
-            </w:r>
-            <w:r>
-              <w:rPr>
-                <w:color w:val="000000"/>
+            <w:r>
+              <w:rPr>
+                <w:b/>
                 <w:spacing w:val="-2"/>
-                <w:sz w:val="21"/>
-                <w:szCs w:val="21"/>
-              </w:rPr>
-              <w:t>queries</w:t>
-            </w:r>
-            <w:r>
-              <w:rPr>
-                <w:color w:val="000000"/>
-                <w:sz w:val="21"/>
-              </w:rPr>
-              <w:tab/>
-            </w:r>
-            <w:r>
-              <w:rPr>
-                <w:color w:val="000000"/>
-                <w:spacing w:val="-5"/>
-                <w:sz w:val="21"/>
-                <w:szCs w:val="21"/>
-              </w:rPr>
-              <w:t xml:space="preserve">to </w:t>
-            </w:r>
-            <w:proofErr w:type="gramStart"/>
-            <w:r>
-              <w:rPr>
-                <w:rFonts w:ascii="Wingdings" w:eastAsia="Wingdings" w:hAnsi="Wingdings" w:cs="Wingdings"/>
-              </w:rPr>
-              <w:t></w:t>
-            </w:r>
-            <w:r>
-              <w:rPr>
-                <w:spacing w:val="-1"/>
-              </w:rPr>
-              <w:t xml:space="preserve"> </w:t>
-            </w:r>
-            <w:r>
-              <w:t>:</w:t>
-            </w:r>
-            <w:proofErr w:type="gramEnd"/>
-            <w:r>
-              <w:rPr>
-                <w:spacing w:val="56"/>
-              </w:rPr>
-              <w:t xml:space="preserve"> </w:t>
-            </w:r>
-            <w:hyperlink r:id="rId14" w:history="1">
-              <w:r>
-                <w:rPr>
-                  <w:rStyle w:val="Hyperlink"/>
-                  <w:b/>
-                  <w:color w:val="467886"/>
-                  <w:spacing w:val="-2"/>
-                </w:rPr>
-                <w:t>{</w:t>
-              </w:r>
-              <w:proofErr w:type="spellStart"/>
-              <w:r>
-                <w:rPr>
-                  <w:rStyle w:val="Hyperlink"/>
-                  <w:b/>
-                  <w:color w:val="467886"/>
-                  <w:spacing w:val="-2"/>
-                </w:rPr>
-                <w:t>sales_user_email</w:t>
-              </w:r>
-              <w:proofErr w:type="spellEnd"/>
-              <w:r>
-                <w:rPr>
-                  <w:rStyle w:val="Hyperlink"/>
-                  <w:b/>
-                  <w:color w:val="467886"/>
-                  <w:spacing w:val="-2"/>
-                </w:rPr>
-                <w:t>}</w:t>
-              </w:r>
-            </w:hyperlink>
+              </w:rPr>
+              <w:t>{sa</w:t>
+            </w:r>
+            <w:r>
+              <w:rPr>
+                <w:b/>
+                <w:spacing w:val="-2"/>
+              </w:rPr>
+              <w:t>les_user_email}</w:t>
+            </w:r>
           </w:p>
         </w:tc>
       </w:tr>
@@ -7242,16 +6521,6 @@
           <w:tab w:val="left" w:pos="7141"/>
         </w:tabs>
         <w:ind w:left="141"/>
-        <w:rPr>
-          <w:b/>
-          <w:sz w:val="24"/>
-        </w:rPr>
-      </w:pPr>
-    </w:p>
-    <w:p>
-      <w:pPr>
-        <w:pStyle w:val="BodyText"/>
-        <w:spacing w:before="9"/>
         <w:rPr>
           <w:b/>
           <w:sz w:val="18"/>
@@ -7376,7 +6645,7 @@
         </mc:Choice>
         <mc:Fallback>
           <w:pict>
-            <v:shape w14:anchorId="0CA952F9" id="Graphic 1" o:spid="_x0000_s1026" style="position:absolute;margin-left:55.2pt;margin-top:764.4pt;width:507.6pt;height:.5pt;z-index:-15938560;visibility:visible;mso-wrap-style:square;mso-wrap-distance-left:0;mso-wrap-distance-top:0;mso-wrap-distance-right:0;mso-wrap-distance-bottom:0;mso-position-horizontal:absolute;mso-position-horizontal-relative:page;mso-position-vertical:absolute;mso-position-vertical-relative:page;v-text-anchor:top" coordsize="6446520,6350" o:gfxdata="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" path="m6446266,l,,,6095r6446266,l6446266,xe" fillcolor="black" stroked="f">
+            <v:shape w14:anchorId="446D1C07" id="Graphic 1" o:spid="_x0000_s1026" style="position:absolute;margin-left:55.2pt;margin-top:764.4pt;width:507.6pt;height:.5pt;z-index:-15938560;visibility:visible;mso-wrap-style:square;mso-wrap-distance-left:0;mso-wrap-distance-top:0;mso-wrap-distance-right:0;mso-wrap-distance-bottom:0;mso-position-horizontal:absolute;mso-position-horizontal-relative:page;mso-position-vertical:absolute;mso-position-vertical-relative:page;v-text-anchor:top" coordsize="6446520,6350" o:gfxdata="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" path="m6446266,l,,,6095r6446266,l6446266,xe" fillcolor="black" stroked="f">
               <v:path arrowok="t"/>
               <w10:wrap anchorx="page" anchory="page"/>
             </v:shape>
@@ -7451,7 +6720,6 @@
                             </w:rPr>
                             <w:t xml:space="preserve"> </w:t>
                           </w:r>
-                          <w:proofErr w:type="gramStart"/>
                           <w:r>
                             <w:rPr>
                               <w:rFonts w:ascii="Arial" w:hAnsi="Arial"/>
@@ -7476,7 +6744,6 @@
                             </w:rPr>
                             <w:t>:</w:t>
                           </w:r>
-                          <w:proofErr w:type="gramEnd"/>
                           <w:r>
                             <w:rPr>
                               <w:rFonts w:ascii="Arial MT" w:hAnsi="Arial MT"/>
@@ -7757,7 +7024,6 @@
                       </w:rPr>
                       <w:t xml:space="preserve"> </w:t>
                     </w:r>
-                    <w:proofErr w:type="gramStart"/>
                     <w:r>
                       <w:rPr>
                         <w:rFonts w:ascii="Arial" w:hAnsi="Arial"/>
@@ -7782,7 +7048,6 @@
                       </w:rPr>
                       <w:t>:</w:t>
                     </w:r>
-                    <w:proofErr w:type="gramEnd"/>
                     <w:r>
                       <w:rPr>
                         <w:rFonts w:ascii="Arial MT" w:hAnsi="Arial MT"/>
@@ -8836,6 +8101,7 @@
   <w:style w:type="paragraph" w:styleId="Heading1">
     <w:name w:val="heading 1"/>
     <w:basedOn w:val="Normal"/>
+    <w:link w:val="Heading1Char"/>
     <w:uiPriority w:val="1"/>
     <w:qFormat/>
     <w:pPr>
@@ -8862,28 +8128,6 @@
       <w:bCs/>
       <w:sz w:val="20"/>
       <w:szCs w:val="20"/>
-    </w:rPr>
-  </w:style>
-  <w:style w:type="paragraph" w:styleId="Heading3">
-    <w:name w:val="heading 3"/>
-    <w:basedOn w:val="Normal"/>
-    <w:next w:val="Normal"/>
-    <w:uiPriority w:val="9"/>
-    <w:semiHidden/>
-    <w:unhideWhenUsed/>
-    <w:qFormat/>
-    <w:rsid w:val="00233D7B"/>
-    <w:pPr>
-      <w:keepNext/>
-      <w:keepLines/>
-      <w:spacing w:before="160" w:after="80"/>
-      <w:outlineLvl w:val="2"/>
-    </w:pPr>
-    <w:rPr>
-      <w:rFonts w:eastAsiaTheme="majorEastAsia" w:cstheme="majorBidi"/>
-      <w:color w:val="365F91" w:themeColor="accent1" w:themeShade="BF"/>
-      <w:sz w:val="28"/>
-      <w:szCs w:val="28"/>
     </w:rPr>
   </w:style>
   <w:style w:type="character" w:default="1" w:styleId="DefaultParagraphFont">
@@ -8916,6 +8160,7 @@
   <w:style w:type="paragraph" w:styleId="BodyText">
     <w:name w:val="Body Text"/>
     <w:basedOn w:val="Normal"/>
+    <w:link w:val="BodyTextChar"/>
     <w:uiPriority w:val="1"/>
     <w:qFormat/>
     <w:rPr>
@@ -8984,11 +8229,46 @@
       <w:szCs w:val="16"/>
     </w:rPr>
   </w:style>
+  <w:style w:type="character" w:customStyle="1" w:styleId="Heading1Char">
+    <w:name w:val="Heading 1 Char"/>
+    <w:basedOn w:val="DefaultParagraphFont"/>
+    <w:link w:val="Heading1"/>
+    <w:uiPriority w:val="1"/>
+    <w:rsid w:val="00D50F28"/>
+    <w:rPr>
+      <w:rFonts w:ascii="Times New Roman" w:eastAsia="Times New Roman" w:hAnsi="Times New Roman" w:cs="Times New Roman"/>
+      <w:b/>
+      <w:bCs/>
+    </w:rPr>
+  </w:style>
+  <w:style w:type="character" w:customStyle="1" w:styleId="BodyTextChar">
+    <w:name w:val="Body Text Char"/>
+    <w:basedOn w:val="DefaultParagraphFont"/>
+    <w:link w:val="BodyText"/>
+    <w:uiPriority w:val="1"/>
+    <w:rsid w:val="00D50F28"/>
+    <w:rPr>
+      <w:rFonts w:ascii="Times New Roman" w:eastAsia="Times New Roman" w:hAnsi="Times New Roman" w:cs="Times New Roman"/>
+      <w:sz w:val="16"/>
+      <w:szCs w:val="16"/>
+    </w:rPr>
+  </w:style>
+  <w:style w:type="character" w:styleId="Hyperlink">
+    <w:name w:val="Hyperlink"/>
+    <w:basedOn w:val="DefaultParagraphFont"/>
+    <w:uiPriority w:val="99"/>
+    <w:unhideWhenUsed/>
+    <w:rsid w:val="00D50F28"/>
+    <w:rPr>
+      <w:color w:val="0000FF" w:themeColor="hyperlink"/>
+      <w:u w:val="single"/>
+    </w:rPr>
+  </w:style>
   <w:style w:type="table" w:styleId="TableGrid">
     <w:name w:val="Table Grid"/>
     <w:basedOn w:val="TableNormal"/>
     <w:uiPriority w:val="59"/>
-    <w:rsid w:val="00455EED"/>
+    <w:rsid w:val="009C1ACF"/>
     <w:tblPr>
       <w:tblBorders>
         <w:top w:val="single" w:sz="4" w:space="0" w:color="auto"/>
@@ -8999,38 +8279,6 @@
         <w:insideV w:val="single" w:sz="4" w:space="0" w:color="auto"/>
       </w:tblBorders>
     </w:tblPr>
-  </w:style>
-  <w:style w:type="paragraph" w:styleId="Subtitle">
-    <w:name w:val="Subtitle"/>
-    <w:basedOn w:val="Normal"/>
-    <w:next w:val="Normal"/>
-    <w:uiPriority w:val="11"/>
-    <w:qFormat/>
-    <w:rsid w:val="00B72667"/>
-    <w:pPr>
-      <w:numPr>
-        <w:ilvl w:val="1"/>
-      </w:numPr>
-      <w:spacing w:after="160"/>
-    </w:pPr>
-    <w:rPr>
-      <w:rFonts w:asciiTheme="minorHAnsi" w:eastAsiaTheme="majorEastAsia" w:hAnsiTheme="minorHAnsi" w:cstheme="majorBidi"/>
-      <w:color w:val="595959" w:themeColor="text1" w:themeTint="A6"/>
-      <w:spacing w:val="15"/>
-      <w:sz w:val="28"/>
-      <w:szCs w:val="28"/>
-    </w:rPr>
-  </w:style>
-  <w:style w:type="character" w:styleId="Hyperlink">
-    <w:name w:val="Hyperlink"/>
-    <w:basedOn w:val="DefaultParagraphFont"/>
-    <w:uiPriority w:val="99"/>
-    <w:unhideWhenUsed/>
-    <w:rsid w:val="00D87CC4"/>
-    <w:rPr>
-      <w:color w:val="0000FF" w:themeColor="hyperlink"/>
-      <w:u w:val="single"/>
-    </w:rPr>
   </w:style>
 </w:styles>
 </file>

</xml_diff>

<commit_message>
feat: fixed tally_fetcher & updated quote generate
</commit_message>
<xml_diff>
--- a/services/template_document.docx
+++ b/services/template_document.docx
@@ -103,6 +103,7 @@
         </w:rPr>
         <w:t xml:space="preserve"> </w:t>
       </w:r>
+      <w:proofErr w:type="gramStart"/>
       <w:r>
         <w:rPr>
           <w:color w:val="17127E"/>
@@ -125,6 +126,7 @@
         </w:rPr>
         <w:t>:</w:t>
       </w:r>
+      <w:proofErr w:type="gramEnd"/>
       <w:r>
         <w:rPr>
           <w:color w:val="17127E"/>
@@ -193,6 +195,7 @@
         </w:rPr>
         <w:t xml:space="preserve"> </w:t>
       </w:r>
+      <w:proofErr w:type="gramStart"/>
       <w:r>
         <w:rPr>
           <w:color w:val="17127E"/>
@@ -215,6 +218,7 @@
         </w:rPr>
         <w:t>:</w:t>
       </w:r>
+      <w:proofErr w:type="gramEnd"/>
       <w:r>
         <w:rPr>
           <w:color w:val="17127E"/>
@@ -342,6 +346,7 @@
         <w:pStyle w:val="Heading2"/>
         <w:spacing w:before="5"/>
       </w:pPr>
+      <w:proofErr w:type="gramStart"/>
       <w:r>
         <w:rPr>
           <w:color w:val="20409A"/>
@@ -361,6 +366,7 @@
         </w:rPr>
         <w:t>:</w:t>
       </w:r>
+      <w:proofErr w:type="gramEnd"/>
       <w:r>
         <w:rPr>
           <w:color w:val="20409A"/>
@@ -383,6 +389,7 @@
         </w:rPr>
         <w:t xml:space="preserve"> </w:t>
       </w:r>
+      <w:proofErr w:type="gramStart"/>
       <w:r>
         <w:rPr>
           <w:color w:val="20409A"/>
@@ -402,6 +409,7 @@
         </w:rPr>
         <w:t>:</w:t>
       </w:r>
+      <w:proofErr w:type="gramEnd"/>
       <w:r>
         <w:rPr>
           <w:color w:val="20409A"/>
@@ -681,8 +689,18 @@
           <w:sz w:val="24"/>
           <w:szCs w:val="24"/>
         </w:rPr>
-        <w:t>Ref. No. :</w:t>
-      </w:r>
+        <w:t xml:space="preserve">Ref. </w:t>
+      </w:r>
+      <w:proofErr w:type="gramStart"/>
+      <w:r>
+        <w:rPr>
+          <w:b/>
+          <w:sz w:val="24"/>
+          <w:szCs w:val="24"/>
+        </w:rPr>
+        <w:t>No. :</w:t>
+      </w:r>
+      <w:proofErr w:type="gramEnd"/>
       <w:r>
         <w:rPr>
           <w:b/>
@@ -707,16 +725,9 @@
           <w:sz w:val="28"/>
           <w:szCs w:val="28"/>
         </w:rPr>
-        <w:t>{quote_num}</w:t>
-      </w:r>
-      <w:r>
-        <w:rPr>
-          <w:b/>
-          <w:color w:val="000000"/>
-          <w:sz w:val="28"/>
-        </w:rPr>
-        <w:tab/>
-      </w:r>
+        <w:t>{</w:t>
+      </w:r>
+      <w:proofErr w:type="spellStart"/>
       <w:r>
         <w:rPr>
           <w:b/>
@@ -724,8 +735,36 @@
           <w:sz w:val="28"/>
           <w:szCs w:val="28"/>
         </w:rPr>
-        <w:t xml:space="preserve">                                                               </w:t>
-      </w:r>
+        <w:t>quote_num</w:t>
+      </w:r>
+      <w:proofErr w:type="spellEnd"/>
+      <w:r>
+        <w:rPr>
+          <w:b/>
+          <w:color w:val="000000"/>
+          <w:sz w:val="28"/>
+          <w:szCs w:val="28"/>
+        </w:rPr>
+        <w:t>}</w:t>
+      </w:r>
+      <w:r>
+        <w:rPr>
+          <w:b/>
+          <w:color w:val="000000"/>
+          <w:sz w:val="28"/>
+        </w:rPr>
+        <w:tab/>
+      </w:r>
+      <w:r>
+        <w:rPr>
+          <w:b/>
+          <w:color w:val="000000"/>
+          <w:sz w:val="28"/>
+          <w:szCs w:val="28"/>
+        </w:rPr>
+        <w:t xml:space="preserve">                                                          </w:t>
+      </w:r>
+      <w:proofErr w:type="gramStart"/>
       <w:r>
         <w:rPr>
           <w:b/>
@@ -739,11 +778,13 @@
         <w:rPr>
           <w:b/>
           <w:color w:val="000000"/>
-          <w:sz w:val="18"/>
-          <w:szCs w:val="18"/>
-        </w:rPr>
-        <w:t>{current_date}</w:t>
-      </w:r>
+          <w:sz w:val="24"/>
+          <w:szCs w:val="24"/>
+        </w:rPr>
+        <w:t>{</w:t>
+      </w:r>
+      <w:proofErr w:type="spellStart"/>
+      <w:proofErr w:type="gramEnd"/>
       <w:r>
         <w:rPr>
           <w:b/>
@@ -751,6 +792,25 @@
           <w:sz w:val="24"/>
           <w:szCs w:val="24"/>
         </w:rPr>
+        <w:t>current_date</w:t>
+      </w:r>
+      <w:proofErr w:type="spellEnd"/>
+      <w:r>
+        <w:rPr>
+          <w:b/>
+          <w:color w:val="000000"/>
+          <w:sz w:val="24"/>
+          <w:szCs w:val="24"/>
+        </w:rPr>
+        <w:t>}</w:t>
+      </w:r>
+      <w:r>
+        <w:rPr>
+          <w:b/>
+          <w:color w:val="000000"/>
+          <w:sz w:val="24"/>
+          <w:szCs w:val="24"/>
+        </w:rPr>
         <w:t xml:space="preserve"> </w:t>
       </w:r>
     </w:p>
@@ -769,7 +829,27 @@
           <w:sz w:val="24"/>
           <w:szCs w:val="24"/>
         </w:rPr>
-        <w:t>{client_company}</w:t>
+        <w:t>{</w:t>
+      </w:r>
+      <w:proofErr w:type="spellStart"/>
+      <w:r>
+        <w:rPr>
+          <w:b/>
+          <w:color w:val="000000"/>
+          <w:sz w:val="24"/>
+          <w:szCs w:val="24"/>
+        </w:rPr>
+        <w:t>client_company</w:t>
+      </w:r>
+      <w:proofErr w:type="spellEnd"/>
+      <w:r>
+        <w:rPr>
+          <w:b/>
+          <w:color w:val="000000"/>
+          <w:sz w:val="24"/>
+          <w:szCs w:val="24"/>
+        </w:rPr>
+        <w:t>}</w:t>
       </w:r>
     </w:p>
     <w:p>
@@ -787,13 +867,22 @@
         <w:ind w:left="141" w:right="7020"/>
       </w:pPr>
       <w:r>
-        <w:t>{client_city-client_postal_code}</w:t>
+        <w:t>{</w:t>
+      </w:r>
+      <w:proofErr w:type="spellStart"/>
+      <w:r>
+        <w:t>client_city-client_postal_code</w:t>
+      </w:r>
+      <w:proofErr w:type="spellEnd"/>
+      <w:r>
+        <w:t>}</w:t>
       </w:r>
     </w:p>
     <w:p>
       <w:pPr>
         <w:ind w:left="196"/>
       </w:pPr>
+      <w:proofErr w:type="gramStart"/>
       <w:r>
         <w:rPr>
           <w:rFonts w:ascii="Wingdings" w:eastAsia="Wingdings" w:hAnsi="Wingdings" w:cs="Wingdings"/>
@@ -809,11 +898,26 @@
       <w:r>
         <w:t>:</w:t>
       </w:r>
+      <w:proofErr w:type="gramEnd"/>
       <w:r>
         <w:rPr>
           <w:spacing w:val="-2"/>
         </w:rPr>
-        <w:t xml:space="preserve"> {client_email}</w:t>
+        <w:t xml:space="preserve"> {</w:t>
+      </w:r>
+      <w:proofErr w:type="spellStart"/>
+      <w:r>
+        <w:rPr>
+          <w:spacing w:val="-2"/>
+        </w:rPr>
+        <w:t>client_email</w:t>
+      </w:r>
+      <w:proofErr w:type="spellEnd"/>
+      <w:r>
+        <w:rPr>
+          <w:spacing w:val="-2"/>
+        </w:rPr>
+        <w:t>}</w:t>
       </w:r>
     </w:p>
     <w:p>
@@ -840,7 +944,15 @@
         <w:t xml:space="preserve"> </w:t>
       </w:r>
       <w:r>
-        <w:t>Attn.: {buyer_name} (</w:t>
+        <w:t>Attn.: {</w:t>
+      </w:r>
+      <w:proofErr w:type="spellStart"/>
+      <w:r>
+        <w:t>buyer_name</w:t>
+      </w:r>
+      <w:proofErr w:type="spellEnd"/>
+      <w:r>
+        <w:t>} (</w:t>
       </w:r>
       <w:r>
         <w:rPr>
@@ -858,6 +970,7 @@
       <w:r>
         <w:t>{</w:t>
       </w:r>
+      <w:proofErr w:type="spellStart"/>
       <w:r>
         <w:rPr>
           <w:rFonts w:ascii="Arial MT" w:eastAsia="Arial MT" w:hAnsi="Arial MT" w:cs="Arial MT"/>
@@ -865,7 +978,17 @@
           <w:sz w:val="24"/>
           <w:szCs w:val="24"/>
         </w:rPr>
-        <w:t>buyer_phone_number}</w:t>
+        <w:t>buyer_phone_number</w:t>
+      </w:r>
+      <w:proofErr w:type="spellEnd"/>
+      <w:r>
+        <w:rPr>
+          <w:rFonts w:ascii="Arial MT" w:eastAsia="Arial MT" w:hAnsi="Arial MT" w:cs="Arial MT"/>
+          <w:b w:val="0"/>
+          <w:sz w:val="24"/>
+          <w:szCs w:val="24"/>
+        </w:rPr>
+        <w:t>}</w:t>
       </w:r>
       <w:r>
         <w:t xml:space="preserve">) </w:t>
@@ -904,9 +1027,11 @@
         </w:rPr>
         <w:t xml:space="preserve"> </w:t>
       </w:r>
+      <w:proofErr w:type="spellStart"/>
       <w:r>
         <w:t>Whatsapp</w:t>
       </w:r>
+      <w:proofErr w:type="spellEnd"/>
       <w:r>
         <w:rPr>
           <w:spacing w:val="19"/>
@@ -932,7 +1057,15 @@
         <w:t xml:space="preserve"> </w:t>
       </w:r>
       <w:r>
-        <w:t>{date_input}</w:t>
+        <w:t>{</w:t>
+      </w:r>
+      <w:proofErr w:type="spellStart"/>
+      <w:r>
+        <w:t>date_input</w:t>
+      </w:r>
+      <w:proofErr w:type="spellEnd"/>
+      <w:r>
+        <w:t>}</w:t>
       </w:r>
     </w:p>
     <w:p>
@@ -1073,7 +1206,7 @@
           </mc:Choice>
           <mc:Fallback>
             <w:pict>
-              <v:shape w14:anchorId="08255382" id="Graphic 5" o:spid="_x0000_s1026" style="position:absolute;margin-left:55.2pt;margin-top:15.4pt;width:507.6pt;height:2.2pt;z-index:-251657216;visibility:visible;mso-wrap-style:square;mso-wrap-distance-left:0;mso-wrap-distance-top:0;mso-wrap-distance-right:0;mso-wrap-distance-bottom:0;mso-position-horizontal:absolute;mso-position-horizontal-relative:page;mso-position-vertical:absolute;mso-position-vertical-relative:text;v-text-anchor:top" coordsize="6446520,27940" o:gfxdata="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" path="m6446266,18288l,18288r,9144l6446266,27432r,-9144xem6446266,l,,,9144r6446266,l6446266,xe" fillcolor="black" stroked="f">
+              <v:shape w14:anchorId="15C65AB9" id="Graphic 5" o:spid="_x0000_s1026" style="position:absolute;margin-left:55.2pt;margin-top:15.4pt;width:507.6pt;height:2.2pt;z-index:-251657216;visibility:visible;mso-wrap-style:square;mso-wrap-distance-left:0;mso-wrap-distance-top:0;mso-wrap-distance-right:0;mso-wrap-distance-bottom:0;mso-position-horizontal:absolute;mso-position-horizontal-relative:page;mso-position-vertical:absolute;mso-position-vertical-relative:text;v-text-anchor:top" coordsize="6446520,27940" o:gfxdata="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" path="m6446266,18288l,18288r,9144l6446266,27432r,-9144xem6446266,l,,,9144r6446266,l6446266,xe" fillcolor="black" stroked="f">
                 <v:path arrowok="t"/>
                 <w10:wrap type="topAndBottom" anchorx="page"/>
               </v:shape>
@@ -1413,6 +1546,7 @@
         </w:rPr>
         <w:t>{</w:t>
       </w:r>
+      <w:proofErr w:type="spellStart"/>
       <w:r>
         <w:rPr>
           <w:bCs/>
@@ -1420,7 +1554,17 @@
           <w:sz w:val="28"/>
           <w:szCs w:val="28"/>
         </w:rPr>
-        <w:t>product_group}</w:t>
+        <w:t>product_group</w:t>
+      </w:r>
+      <w:proofErr w:type="spellEnd"/>
+      <w:r>
+        <w:rPr>
+          <w:bCs/>
+          <w:spacing w:val="-2"/>
+          <w:sz w:val="28"/>
+          <w:szCs w:val="28"/>
+        </w:rPr>
+        <w:t>}</w:t>
       </w:r>
     </w:p>
     <w:p>
@@ -1429,8 +1573,6 @@
         <w:spacing w:before="15"/>
         <w:ind w:firstLine="141"/>
         <w:rPr>
-          <w:b/>
-          <w:i/>
           <w:sz w:val="28"/>
           <w:szCs w:val="28"/>
         </w:rPr>
@@ -1440,28 +1582,39 @@
           <w:sz w:val="28"/>
           <w:szCs w:val="28"/>
         </w:rPr>
-        <w:t>{special_model_table}</w:t>
+        <w:t>{</w:t>
+      </w:r>
+      <w:proofErr w:type="spellStart"/>
+      <w:r>
+        <w:rPr>
+          <w:sz w:val="28"/>
+          <w:szCs w:val="28"/>
+        </w:rPr>
+        <w:t>special_model_table</w:t>
+      </w:r>
+      <w:proofErr w:type="spellEnd"/>
+      <w:r>
+        <w:rPr>
+          <w:sz w:val="28"/>
+          <w:szCs w:val="28"/>
+        </w:rPr>
+        <w:t>}</w:t>
       </w:r>
     </w:p>
     <w:p>
       <w:pPr>
         <w:pStyle w:val="BodyText"/>
         <w:spacing w:before="15"/>
+        <w:ind w:firstLine="141"/>
         <w:rPr>
           <w:b/>
           <w:i/>
-          <w:sz w:val="20"/>
+          <w:sz w:val="28"/>
+          <w:szCs w:val="28"/>
         </w:rPr>
       </w:pPr>
-    </w:p>
-    <w:p>
-      <w:pPr>
-        <w:pStyle w:val="Heading1"/>
-        <w:ind w:firstLine="0"/>
-      </w:pPr>
-      <w:r>
-        <w:rPr>
-          <w:b w:val="0"/>
+      <w:r>
+        <w:rPr>
           <w:color w:val="000000"/>
           <w:highlight w:val="yellow"/>
         </w:rPr>
@@ -1469,7 +1622,6 @@
       </w:r>
       <w:r>
         <w:rPr>
-          <w:b w:val="0"/>
           <w:color w:val="000000"/>
           <w:spacing w:val="44"/>
         </w:rPr>
@@ -2116,12 +2268,21 @@
               </w:rPr>
               <w:t xml:space="preserve"> </w:t>
             </w:r>
-            <w:r>
-              <w:rPr>
-                <w:sz w:val="20"/>
-                <w:szCs w:val="20"/>
-              </w:rPr>
-              <w:t>upto customer destination will be borne by customer.</w:t>
+            <w:proofErr w:type="spellStart"/>
+            <w:r>
+              <w:rPr>
+                <w:sz w:val="20"/>
+                <w:szCs w:val="20"/>
+              </w:rPr>
+              <w:t>upto</w:t>
+            </w:r>
+            <w:proofErr w:type="spellEnd"/>
+            <w:r>
+              <w:rPr>
+                <w:sz w:val="20"/>
+                <w:szCs w:val="20"/>
+              </w:rPr>
+              <w:t xml:space="preserve"> customer destination will be borne by customer.</w:t>
             </w:r>
           </w:p>
         </w:tc>
@@ -4233,7 +4394,25 @@
                 <w:sz w:val="19"/>
                 <w:szCs w:val="19"/>
               </w:rPr>
-              <w:t xml:space="preserve">. All equipment will be delivered upto main gate of the customer premises. Unloading of material &amp; moving inside the lab. or working place must be taken care by customer i.e. </w:t>
+              <w:t xml:space="preserve">. All equipment will be delivered </w:t>
+            </w:r>
+            <w:proofErr w:type="spellStart"/>
+            <w:r>
+              <w:rPr>
+                <w:color w:val="000000"/>
+                <w:sz w:val="19"/>
+                <w:szCs w:val="19"/>
+              </w:rPr>
+              <w:t>upto</w:t>
+            </w:r>
+            <w:proofErr w:type="spellEnd"/>
+            <w:r>
+              <w:rPr>
+                <w:color w:val="000000"/>
+                <w:sz w:val="19"/>
+                <w:szCs w:val="19"/>
+              </w:rPr>
+              <w:t xml:space="preserve"> main gate of the customer premises. Unloading of material &amp; moving inside the lab. or working place must be taken care by customer i.e. </w:t>
             </w:r>
             <w:r>
               <w:rPr>
@@ -4872,9 +5051,11 @@
         </w:rPr>
         <w:t xml:space="preserve"> </w:t>
       </w:r>
+      <w:proofErr w:type="spellStart"/>
       <w:r>
         <w:t>equipments</w:t>
       </w:r>
+      <w:proofErr w:type="spellEnd"/>
       <w:r>
         <w:rPr>
           <w:spacing w:val="-8"/>
@@ -5004,9 +5185,11 @@
         </w:rPr>
         <w:t xml:space="preserve"> </w:t>
       </w:r>
+      <w:proofErr w:type="gramStart"/>
       <w:r>
         <w:t>However</w:t>
       </w:r>
+      <w:proofErr w:type="gramEnd"/>
       <w:r>
         <w:rPr>
           <w:spacing w:val="-4"/>
@@ -5032,7 +5215,15 @@
         <w:t xml:space="preserve"> </w:t>
       </w:r>
       <w:r>
-        <w:t>information the equipments warranty as below:</w:t>
+        <w:t xml:space="preserve">information the </w:t>
+      </w:r>
+      <w:proofErr w:type="spellStart"/>
+      <w:r>
+        <w:t>equipments</w:t>
+      </w:r>
+      <w:proofErr w:type="spellEnd"/>
+      <w:r>
+        <w:t xml:space="preserve"> warranty as below:</w:t>
       </w:r>
     </w:p>
     <w:p>
@@ -5260,7 +5451,21 @@
         <w:rPr>
           <w:sz w:val="16"/>
         </w:rPr>
-        <w:t>Water stills / Water Baths / constant temperature Bath &amp; Cryo Bath are also guaranteed for 12 months excluding heating elements, as</w:t>
+        <w:t xml:space="preserve">Water stills / Water Baths / constant temperature Bath &amp; </w:t>
+      </w:r>
+      <w:proofErr w:type="spellStart"/>
+      <w:r>
+        <w:rPr>
+          <w:sz w:val="16"/>
+        </w:rPr>
+        <w:t>Cryo</w:t>
+      </w:r>
+      <w:proofErr w:type="spellEnd"/>
+      <w:r>
+        <w:rPr>
+          <w:sz w:val="16"/>
+        </w:rPr>
+        <w:t xml:space="preserve"> Bath are also guaranteed for 12 months excluding heating elements, as</w:t>
       </w:r>
       <w:r>
         <w:rPr>
@@ -5282,11 +5487,19 @@
         </w:rPr>
         <w:t xml:space="preserve"> </w:t>
       </w:r>
+      <w:proofErr w:type="gramStart"/>
       <w:r>
         <w:rPr>
           <w:sz w:val="16"/>
         </w:rPr>
-        <w:t>However our customers are assured of rigorous tests of these parts.</w:t>
+        <w:t>However</w:t>
+      </w:r>
+      <w:proofErr w:type="gramEnd"/>
+      <w:r>
+        <w:rPr>
+          <w:sz w:val="16"/>
+        </w:rPr>
+        <w:t xml:space="preserve"> our customers are assured of rigorous tests of these parts.</w:t>
       </w:r>
     </w:p>
     <w:p>
@@ -5305,6 +5518,7 @@
           <w:sz w:val="16"/>
         </w:rPr>
       </w:pPr>
+      <w:proofErr w:type="gramStart"/>
       <w:r>
         <w:rPr>
           <w:sz w:val="16"/>
@@ -5324,6 +5538,7 @@
         </w:rPr>
         <w:t>:</w:t>
       </w:r>
+      <w:proofErr w:type="gramEnd"/>
       <w:r>
         <w:rPr>
           <w:spacing w:val="-3"/>
@@ -5474,6 +5689,7 @@
         </w:rPr>
         <w:t xml:space="preserve"> </w:t>
       </w:r>
+      <w:proofErr w:type="gramStart"/>
       <w:r>
         <w:rPr>
           <w:sz w:val="16"/>
@@ -5492,7 +5708,15 @@
           <w:spacing w:val="-5"/>
           <w:sz w:val="16"/>
         </w:rPr>
-        <w:t>:-</w:t>
+        <w:t>:</w:t>
+      </w:r>
+      <w:proofErr w:type="gramEnd"/>
+      <w:r>
+        <w:rPr>
+          <w:spacing w:val="-5"/>
+          <w:sz w:val="16"/>
+        </w:rPr>
+        <w:t>-</w:t>
       </w:r>
     </w:p>
     <w:p>
@@ -5609,9 +5833,11 @@
         </w:rPr>
         <w:t xml:space="preserve"> </w:t>
       </w:r>
+      <w:proofErr w:type="gramStart"/>
       <w:r>
         <w:t>users</w:t>
       </w:r>
+      <w:proofErr w:type="gramEnd"/>
       <w:r>
         <w:rPr>
           <w:spacing w:val="-1"/>
@@ -5720,7 +5946,15 @@
         <w:t xml:space="preserve"> </w:t>
       </w:r>
       <w:r>
-        <w:t>Inner mould of</w:t>
+        <w:t xml:space="preserve">Inner </w:t>
+      </w:r>
+      <w:proofErr w:type="spellStart"/>
+      <w:r>
+        <w:t>mould</w:t>
+      </w:r>
+      <w:proofErr w:type="spellEnd"/>
+      <w:r>
+        <w:t xml:space="preserve"> of</w:t>
       </w:r>
       <w:r>
         <w:rPr>
@@ -5845,8 +6079,13 @@
         </w:rPr>
         <w:t xml:space="preserve"> </w:t>
       </w:r>
-      <w:r>
-        <w:t>filled we</w:t>
+      <w:proofErr w:type="gramStart"/>
+      <w:r>
+        <w:t>filled</w:t>
+      </w:r>
+      <w:proofErr w:type="gramEnd"/>
+      <w:r>
+        <w:t xml:space="preserve"> we</w:t>
       </w:r>
       <w:r>
         <w:rPr>
@@ -5918,7 +6157,15 @@
         <w:t xml:space="preserve"> </w:t>
       </w:r>
       <w:r>
-        <w:t>cracks. If customer requires our service engineer then visit charges will be EXTRA</w:t>
+        <w:t xml:space="preserve">cracks. If customer requires our service </w:t>
+      </w:r>
+      <w:proofErr w:type="gramStart"/>
+      <w:r>
+        <w:t>engineer</w:t>
+      </w:r>
+      <w:proofErr w:type="gramEnd"/>
+      <w:r>
+        <w:t xml:space="preserve"> then visit charges will be EXTRA</w:t>
       </w:r>
     </w:p>
     <w:p>
@@ -6159,8 +6406,42 @@
           <w:szCs w:val="24"/>
           <w:highlight w:val="cyan"/>
         </w:rPr>
-        <w:t>{sales_user_name}(</w:t>
-      </w:r>
+        <w:t>{</w:t>
+      </w:r>
+      <w:proofErr w:type="spellStart"/>
+      <w:r>
+        <w:rPr>
+          <w:b/>
+          <w:color w:val="000000"/>
+          <w:sz w:val="24"/>
+          <w:szCs w:val="24"/>
+          <w:highlight w:val="cyan"/>
+        </w:rPr>
+        <w:t>sales_user_</w:t>
+      </w:r>
+      <w:proofErr w:type="gramStart"/>
+      <w:r>
+        <w:rPr>
+          <w:b/>
+          <w:color w:val="000000"/>
+          <w:sz w:val="24"/>
+          <w:szCs w:val="24"/>
+          <w:highlight w:val="cyan"/>
+        </w:rPr>
+        <w:t>name</w:t>
+      </w:r>
+      <w:proofErr w:type="spellEnd"/>
+      <w:r>
+        <w:rPr>
+          <w:b/>
+          <w:color w:val="000000"/>
+          <w:sz w:val="24"/>
+          <w:szCs w:val="24"/>
+          <w:highlight w:val="cyan"/>
+        </w:rPr>
+        <w:t>}(</w:t>
+      </w:r>
+      <w:proofErr w:type="gramEnd"/>
       <w:r>
         <w:rPr>
           <w:rFonts w:ascii="Webdings" w:eastAsia="Webdings" w:hAnsi="Webdings" w:cs="Webdings"/>
@@ -6191,6 +6472,7 @@
         </w:rPr>
         <w:t>{</w:t>
       </w:r>
+      <w:proofErr w:type="spellStart"/>
       <w:r>
         <w:rPr>
           <w:b/>
@@ -6201,6 +6483,7 @@
         </w:rPr>
         <w:t>business_phone</w:t>
       </w:r>
+      <w:proofErr w:type="spellEnd"/>
       <w:r>
         <w:rPr>
           <w:rFonts w:ascii="Arial" w:eastAsia="Arial" w:hAnsi="Arial" w:cs="Arial"/>
@@ -6247,6 +6530,7 @@
                 <w:sz w:val="20"/>
               </w:rPr>
             </w:pPr>
+            <w:proofErr w:type="gramStart"/>
             <w:r>
               <w:rPr>
                 <w:b/>
@@ -6273,6 +6557,7 @@
               </w:rPr>
               <w:t>:</w:t>
             </w:r>
+            <w:proofErr w:type="gramEnd"/>
           </w:p>
           <w:p>
             <w:pPr>
@@ -6413,7 +6698,29 @@
                 <w:sz w:val="20"/>
                 <w:szCs w:val="20"/>
               </w:rPr>
-              <w:t xml:space="preserve">{business_phone} </w:t>
+              <w:t>{</w:t>
+            </w:r>
+            <w:proofErr w:type="spellStart"/>
+            <w:r>
+              <w:rPr>
+                <w:b/>
+                <w:color w:val="000000"/>
+                <w:spacing w:val="-2"/>
+                <w:sz w:val="20"/>
+                <w:szCs w:val="20"/>
+              </w:rPr>
+              <w:t>business_phone</w:t>
+            </w:r>
+            <w:proofErr w:type="spellEnd"/>
+            <w:r>
+              <w:rPr>
+                <w:b/>
+                <w:color w:val="000000"/>
+                <w:spacing w:val="-2"/>
+                <w:sz w:val="20"/>
+                <w:szCs w:val="20"/>
+              </w:rPr>
+              <w:t xml:space="preserve">} </w:t>
             </w:r>
             <w:r>
               <w:rPr>
@@ -6476,6 +6783,7 @@
               </w:rPr>
               <w:t xml:space="preserve">to </w:t>
             </w:r>
+            <w:proofErr w:type="gramStart"/>
             <w:r>
               <w:rPr>
                 <w:rFonts w:ascii="Wingdings" w:eastAsia="Wingdings" w:hAnsi="Wingdings" w:cs="Wingdings"/>
@@ -6491,6 +6799,7 @@
             <w:r>
               <w:t>:</w:t>
             </w:r>
+            <w:proofErr w:type="gramEnd"/>
             <w:r>
               <w:rPr>
                 <w:spacing w:val="56"/>
@@ -6502,14 +6811,30 @@
                 <w:b/>
                 <w:spacing w:val="-2"/>
               </w:rPr>
-              <w:t>{sa</w:t>
-            </w:r>
+              <w:t>{</w:t>
+            </w:r>
+            <w:proofErr w:type="spellStart"/>
             <w:r>
               <w:rPr>
                 <w:b/>
                 <w:spacing w:val="-2"/>
               </w:rPr>
-              <w:t>les_user_email}</w:t>
+              <w:t>sa</w:t>
+            </w:r>
+            <w:r>
+              <w:rPr>
+                <w:b/>
+                <w:spacing w:val="-2"/>
+              </w:rPr>
+              <w:t>les_user_email</w:t>
+            </w:r>
+            <w:proofErr w:type="spellEnd"/>
+            <w:r>
+              <w:rPr>
+                <w:b/>
+                <w:spacing w:val="-2"/>
+              </w:rPr>
+              <w:t>}</w:t>
             </w:r>
           </w:p>
         </w:tc>
@@ -6645,7 +6970,7 @@
         </mc:Choice>
         <mc:Fallback>
           <w:pict>
-            <v:shape w14:anchorId="446D1C07" id="Graphic 1" o:spid="_x0000_s1026" style="position:absolute;margin-left:55.2pt;margin-top:764.4pt;width:507.6pt;height:.5pt;z-index:-15938560;visibility:visible;mso-wrap-style:square;mso-wrap-distance-left:0;mso-wrap-distance-top:0;mso-wrap-distance-right:0;mso-wrap-distance-bottom:0;mso-position-horizontal:absolute;mso-position-horizontal-relative:page;mso-position-vertical:absolute;mso-position-vertical-relative:page;v-text-anchor:top" coordsize="6446520,6350" o:gfxdata="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" path="m6446266,l,,,6095r6446266,l6446266,xe" fillcolor="black" stroked="f">
+            <v:shape w14:anchorId="087E2AED" id="Graphic 1" o:spid="_x0000_s1026" style="position:absolute;margin-left:55.2pt;margin-top:764.4pt;width:507.6pt;height:.5pt;z-index:-15938560;visibility:visible;mso-wrap-style:square;mso-wrap-distance-left:0;mso-wrap-distance-top:0;mso-wrap-distance-right:0;mso-wrap-distance-bottom:0;mso-position-horizontal:absolute;mso-position-horizontal-relative:page;mso-position-vertical:absolute;mso-position-vertical-relative:page;v-text-anchor:top" coordsize="6446520,6350" o:gfxdata="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" path="m6446266,l,,,6095r6446266,l6446266,xe" fillcolor="black" stroked="f">
               <v:path arrowok="t"/>
               <w10:wrap anchorx="page" anchory="page"/>
             </v:shape>
@@ -6720,6 +7045,7 @@
                             </w:rPr>
                             <w:t xml:space="preserve"> </w:t>
                           </w:r>
+                          <w:proofErr w:type="gramStart"/>
                           <w:r>
                             <w:rPr>
                               <w:rFonts w:ascii="Arial" w:hAnsi="Arial"/>
@@ -6744,6 +7070,7 @@
                             </w:rPr>
                             <w:t>:</w:t>
                           </w:r>
+                          <w:proofErr w:type="gramEnd"/>
                           <w:r>
                             <w:rPr>
                               <w:rFonts w:ascii="Arial MT" w:hAnsi="Arial MT"/>
@@ -7024,6 +7351,7 @@
                       </w:rPr>
                       <w:t xml:space="preserve"> </w:t>
                     </w:r>
+                    <w:proofErr w:type="gramStart"/>
                     <w:r>
                       <w:rPr>
                         <w:rFonts w:ascii="Arial" w:hAnsi="Arial"/>
@@ -7048,6 +7376,7 @@
                       </w:rPr>
                       <w:t>:</w:t>
                     </w:r>
+                    <w:proofErr w:type="gramEnd"/>
                     <w:r>
                       <w:rPr>
                         <w:rFonts w:ascii="Arial MT" w:hAnsi="Arial MT"/>

</xml_diff>